<commit_message>
Polish report and add executed Colab notebook with outputs
</commit_message>
<xml_diff>
--- a/docs/CEP_Report.docx
+++ b/docs/CEP_Report.docx
@@ -36,9 +36,7 @@
                     </pic:cNvPicPr>
                   </pic:nvPicPr>
                   <pic:blipFill>
-                    <a:blip r:embed="rId8">
-                      <a:grayscl/>
-                    </a:blip>
+                    <a:blip r:embed="rId8"/>
                     <a:stretch>
                       <a:fillRect/>
                     </a:stretch>
@@ -365,7 +363,7 @@
         <w:ind w:left="290" w:firstLine="0"/>
       </w:pPr>
       <w:r>
-        <w:t>7. ____________________   8. ____________________   9. ____________________   10. ____________________</w:t>
+        <w:t>7. ____________________   8. ____________________   9. ____________________</w:t>
       </w:r>
       <w:r>
         <w:rPr>
@@ -385,6 +383,34 @@
         </w:rPr>
       </w:r>
       <w:r/>
+    </w:p>
+    <w:p>
+      <w:pPr>
+        <w:pStyle w:val="BodyText"/>
+        <w:keepNext w:val="0"/>
+        <w:spacing w:before="39" w:after="120"/>
+        <w:ind w:left="290" w:firstLine="0"/>
+      </w:pPr>
+      <w:r>
+        <w:rPr>
+          <w:b w:val="0"/>
+        </w:rPr>
+        <w:t>10. ____________________   11. ____________________   12. ____________________</w:t>
+      </w:r>
+    </w:p>
+    <w:p>
+      <w:pPr>
+        <w:pStyle w:val="BodyText"/>
+        <w:keepNext w:val="0"/>
+        <w:spacing w:before="39" w:after="120"/>
+        <w:ind w:left="290" w:firstLine="0"/>
+      </w:pPr>
+      <w:r>
+        <w:rPr>
+          <w:b w:val="0"/>
+        </w:rPr>
+        <w:t>13. ____________________</w:t>
+      </w:r>
     </w:p>
     <w:p>
       <w:pPr>
@@ -2207,9 +2233,7 @@
                     <pic:cNvPicPr/>
                   </pic:nvPicPr>
                   <pic:blipFill>
-                    <a:blip r:embed="rId13">
-                      <a:grayscl/>
-                    </a:blip>
+                    <a:blip r:embed="rId13"/>
                     <a:stretch>
                       <a:fillRect/>
                     </a:stretch>
@@ -3489,80 +3513,825 @@
       <w:pPr>
         <w:pStyle w:val="BodyText"/>
         <w:keepNext w:val="0"/>
-        <w:spacing w:before="39" w:after="120"/>
+        <w:spacing w:before="39" w:after="40"/>
         <w:ind w:left="290" w:firstLine="0"/>
       </w:pPr>
       <w:r>
         <w:rPr>
-          <w:rFonts w:ascii="Consolas" w:hAnsi="Consolas"/>
           <w:b w:val="0"/>
-          <w:sz w:val="18"/>
-        </w:rPr>
-        <w:t>floors = minimum_fraction * demand</w:t>
+        </w:rPr>
+      </w:r>
+      <w:r>
+        <w:rPr>
+          <w:rFonts w:ascii="Consolas" w:hAnsi="Consolas"/>
+          <w:color w:val="1F2937"/>
+          <w:sz w:val="18"/>
+        </w:rPr>
+        <w:t>floors</w:t>
+      </w:r>
+      <w:r>
+        <w:rPr>
+          <w:rFonts w:ascii="Consolas" w:hAnsi="Consolas"/>
+          <w:color w:val="1F2937"/>
+          <w:sz w:val="18"/>
+        </w:rPr>
+        <w:t xml:space="preserve"> </w:t>
+      </w:r>
+      <w:r>
+        <w:rPr>
+          <w:rFonts w:ascii="Consolas" w:hAnsi="Consolas"/>
+          <w:color w:val="1F2937"/>
+          <w:sz w:val="18"/>
+        </w:rPr>
+        <w:t>=</w:t>
+      </w:r>
+      <w:r>
+        <w:rPr>
+          <w:rFonts w:ascii="Consolas" w:hAnsi="Consolas"/>
+          <w:color w:val="1F2937"/>
+          <w:sz w:val="18"/>
+        </w:rPr>
+        <w:t xml:space="preserve"> </w:t>
+      </w:r>
+      <w:r>
+        <w:rPr>
+          <w:rFonts w:ascii="Consolas" w:hAnsi="Consolas"/>
+          <w:color w:val="1F2937"/>
+          <w:sz w:val="18"/>
+        </w:rPr>
+        <w:t>minimum_fraction</w:t>
+      </w:r>
+      <w:r>
+        <w:rPr>
+          <w:rFonts w:ascii="Consolas" w:hAnsi="Consolas"/>
+          <w:color w:val="1F2937"/>
+          <w:sz w:val="18"/>
+        </w:rPr>
+        <w:t xml:space="preserve"> </w:t>
+      </w:r>
+      <w:r>
+        <w:rPr>
+          <w:rFonts w:ascii="Consolas" w:hAnsi="Consolas"/>
+          <w:color w:val="1F2937"/>
+          <w:sz w:val="18"/>
+        </w:rPr>
+        <w:t>*</w:t>
+      </w:r>
+      <w:r>
+        <w:rPr>
+          <w:rFonts w:ascii="Consolas" w:hAnsi="Consolas"/>
+          <w:color w:val="1F2937"/>
+          <w:sz w:val="18"/>
+        </w:rPr>
+        <w:t xml:space="preserve"> </w:t>
+      </w:r>
+      <w:r>
+        <w:rPr>
+          <w:rFonts w:ascii="Consolas" w:hAnsi="Consolas"/>
+          <w:color w:val="1F2937"/>
+          <w:sz w:val="18"/>
+        </w:rPr>
+        <w:t>demand</w:t>
       </w:r>
     </w:p>
     <w:p>
       <w:pPr>
         <w:pStyle w:val="BodyText"/>
         <w:keepNext w:val="0"/>
-        <w:spacing w:before="39" w:after="120"/>
+        <w:spacing w:before="39" w:after="40"/>
         <w:ind w:left="290" w:firstLine="0"/>
       </w:pPr>
       <w:r>
         <w:rPr>
-          <w:rFonts w:ascii="Consolas" w:hAnsi="Consolas"/>
           <w:b w:val="0"/>
-          <w:sz w:val="18"/>
-        </w:rPr>
-        <w:t>upper = np.minimum(demand, capacity)</w:t>
+        </w:rPr>
+      </w:r>
+      <w:r>
+        <w:rPr>
+          <w:rFonts w:ascii="Consolas" w:hAnsi="Consolas"/>
+          <w:color w:val="1F2937"/>
+          <w:sz w:val="18"/>
+        </w:rPr>
+        <w:t>upper</w:t>
+      </w:r>
+      <w:r>
+        <w:rPr>
+          <w:rFonts w:ascii="Consolas" w:hAnsi="Consolas"/>
+          <w:color w:val="1F2937"/>
+          <w:sz w:val="18"/>
+        </w:rPr>
+        <w:t xml:space="preserve"> </w:t>
+      </w:r>
+      <w:r>
+        <w:rPr>
+          <w:rFonts w:ascii="Consolas" w:hAnsi="Consolas"/>
+          <w:color w:val="1F2937"/>
+          <w:sz w:val="18"/>
+        </w:rPr>
+        <w:t>=</w:t>
+      </w:r>
+      <w:r>
+        <w:rPr>
+          <w:rFonts w:ascii="Consolas" w:hAnsi="Consolas"/>
+          <w:color w:val="1F2937"/>
+          <w:sz w:val="18"/>
+        </w:rPr>
+        <w:t xml:space="preserve"> </w:t>
+      </w:r>
+      <w:r>
+        <w:rPr>
+          <w:rFonts w:ascii="Consolas" w:hAnsi="Consolas"/>
+          <w:color w:val="1F2937"/>
+          <w:sz w:val="18"/>
+        </w:rPr>
+        <w:t>np</w:t>
+      </w:r>
+      <w:r>
+        <w:rPr>
+          <w:rFonts w:ascii="Consolas" w:hAnsi="Consolas"/>
+          <w:color w:val="1F2937"/>
+          <w:sz w:val="18"/>
+        </w:rPr>
+        <w:t>.</w:t>
+      </w:r>
+      <w:r>
+        <w:rPr>
+          <w:rFonts w:ascii="Consolas" w:hAnsi="Consolas"/>
+          <w:color w:val="1F2937"/>
+          <w:sz w:val="18"/>
+        </w:rPr>
+        <w:t>minimum</w:t>
+      </w:r>
+      <w:r>
+        <w:rPr>
+          <w:rFonts w:ascii="Consolas" w:hAnsi="Consolas"/>
+          <w:color w:val="1F2937"/>
+          <w:sz w:val="18"/>
+        </w:rPr>
+        <w:t>(</w:t>
+      </w:r>
+      <w:r>
+        <w:rPr>
+          <w:rFonts w:ascii="Consolas" w:hAnsi="Consolas"/>
+          <w:color w:val="1F2937"/>
+          <w:sz w:val="18"/>
+        </w:rPr>
+        <w:t>demand</w:t>
+      </w:r>
+      <w:r>
+        <w:rPr>
+          <w:rFonts w:ascii="Consolas" w:hAnsi="Consolas"/>
+          <w:color w:val="1F2937"/>
+          <w:sz w:val="18"/>
+        </w:rPr>
+        <w:t>,</w:t>
+      </w:r>
+      <w:r>
+        <w:rPr>
+          <w:rFonts w:ascii="Consolas" w:hAnsi="Consolas"/>
+          <w:color w:val="1F2937"/>
+          <w:sz w:val="18"/>
+        </w:rPr>
+        <w:t xml:space="preserve"> </w:t>
+      </w:r>
+      <w:r>
+        <w:rPr>
+          <w:rFonts w:ascii="Consolas" w:hAnsi="Consolas"/>
+          <w:color w:val="1F2937"/>
+          <w:sz w:val="18"/>
+        </w:rPr>
+        <w:t>capacity</w:t>
+      </w:r>
+      <w:r>
+        <w:rPr>
+          <w:rFonts w:ascii="Consolas" w:hAnsi="Consolas"/>
+          <w:color w:val="1F2937"/>
+          <w:sz w:val="18"/>
+        </w:rPr>
+        <w:t>)</w:t>
       </w:r>
     </w:p>
     <w:p>
       <w:pPr>
         <w:pStyle w:val="BodyText"/>
         <w:keepNext w:val="0"/>
-        <w:spacing w:before="39" w:after="120"/>
+        <w:spacing w:before="39" w:after="40"/>
         <w:ind w:left="290" w:firstLine="0"/>
       </w:pPr>
       <w:r>
         <w:rPr>
-          <w:rFonts w:ascii="Consolas" w:hAnsi="Consolas"/>
           <w:b w:val="0"/>
-          <w:sz w:val="18"/>
-        </w:rPr>
-        <w:t>feasible = supply &gt;= floors.sum() and np.all(upper &gt;= floors)</w:t>
+        </w:rPr>
+      </w:r>
+      <w:r>
+        <w:rPr>
+          <w:rFonts w:ascii="Consolas" w:hAnsi="Consolas"/>
+          <w:color w:val="1F2937"/>
+          <w:sz w:val="18"/>
+        </w:rPr>
+        <w:t>feasible</w:t>
+      </w:r>
+      <w:r>
+        <w:rPr>
+          <w:rFonts w:ascii="Consolas" w:hAnsi="Consolas"/>
+          <w:color w:val="1F2937"/>
+          <w:sz w:val="18"/>
+        </w:rPr>
+        <w:t xml:space="preserve"> </w:t>
+      </w:r>
+      <w:r>
+        <w:rPr>
+          <w:rFonts w:ascii="Consolas" w:hAnsi="Consolas"/>
+          <w:color w:val="1F2937"/>
+          <w:sz w:val="18"/>
+        </w:rPr>
+        <w:t>=</w:t>
+      </w:r>
+      <w:r>
+        <w:rPr>
+          <w:rFonts w:ascii="Consolas" w:hAnsi="Consolas"/>
+          <w:color w:val="1F2937"/>
+          <w:sz w:val="18"/>
+        </w:rPr>
+        <w:t xml:space="preserve"> </w:t>
+      </w:r>
+      <w:r>
+        <w:rPr>
+          <w:rFonts w:ascii="Consolas" w:hAnsi="Consolas"/>
+          <w:color w:val="1F2937"/>
+          <w:sz w:val="18"/>
+        </w:rPr>
+        <w:t>supply</w:t>
+      </w:r>
+      <w:r>
+        <w:rPr>
+          <w:rFonts w:ascii="Consolas" w:hAnsi="Consolas"/>
+          <w:color w:val="1F2937"/>
+          <w:sz w:val="18"/>
+        </w:rPr>
+        <w:t xml:space="preserve"> </w:t>
+      </w:r>
+      <w:r>
+        <w:rPr>
+          <w:rFonts w:ascii="Consolas" w:hAnsi="Consolas"/>
+          <w:color w:val="1F2937"/>
+          <w:sz w:val="18"/>
+        </w:rPr>
+        <w:t>&gt;</w:t>
+      </w:r>
+      <w:r>
+        <w:rPr>
+          <w:rFonts w:ascii="Consolas" w:hAnsi="Consolas"/>
+          <w:color w:val="1F2937"/>
+          <w:sz w:val="18"/>
+        </w:rPr>
+        <w:t>=</w:t>
+      </w:r>
+      <w:r>
+        <w:rPr>
+          <w:rFonts w:ascii="Consolas" w:hAnsi="Consolas"/>
+          <w:color w:val="1F2937"/>
+          <w:sz w:val="18"/>
+        </w:rPr>
+        <w:t xml:space="preserve"> </w:t>
+      </w:r>
+      <w:r>
+        <w:rPr>
+          <w:rFonts w:ascii="Consolas" w:hAnsi="Consolas"/>
+          <w:color w:val="1F2937"/>
+          <w:sz w:val="18"/>
+        </w:rPr>
+        <w:t>floors</w:t>
+      </w:r>
+      <w:r>
+        <w:rPr>
+          <w:rFonts w:ascii="Consolas" w:hAnsi="Consolas"/>
+          <w:color w:val="1F2937"/>
+          <w:sz w:val="18"/>
+        </w:rPr>
+        <w:t>.</w:t>
+      </w:r>
+      <w:r>
+        <w:rPr>
+          <w:rFonts w:ascii="Consolas" w:hAnsi="Consolas"/>
+          <w:color w:val="1F2937"/>
+          <w:sz w:val="18"/>
+        </w:rPr>
+        <w:t>sum</w:t>
+      </w:r>
+      <w:r>
+        <w:rPr>
+          <w:rFonts w:ascii="Consolas" w:hAnsi="Consolas"/>
+          <w:color w:val="1F2937"/>
+          <w:sz w:val="18"/>
+        </w:rPr>
+        <w:t>(</w:t>
+      </w:r>
+      <w:r>
+        <w:rPr>
+          <w:rFonts w:ascii="Consolas" w:hAnsi="Consolas"/>
+          <w:color w:val="1F2937"/>
+          <w:sz w:val="18"/>
+        </w:rPr>
+        <w:t>)</w:t>
+      </w:r>
+      <w:r>
+        <w:rPr>
+          <w:rFonts w:ascii="Consolas" w:hAnsi="Consolas"/>
+          <w:color w:val="1F2937"/>
+          <w:sz w:val="18"/>
+        </w:rPr>
+        <w:t xml:space="preserve"> </w:t>
+      </w:r>
+      <w:r>
+        <w:rPr>
+          <w:rFonts w:ascii="Consolas" w:hAnsi="Consolas"/>
+          <w:color w:val="1F2937"/>
+          <w:sz w:val="18"/>
+        </w:rPr>
+        <w:t>and</w:t>
+      </w:r>
+      <w:r>
+        <w:rPr>
+          <w:rFonts w:ascii="Consolas" w:hAnsi="Consolas"/>
+          <w:color w:val="1F2937"/>
+          <w:sz w:val="18"/>
+        </w:rPr>
+        <w:t xml:space="preserve"> </w:t>
+      </w:r>
+      <w:r>
+        <w:rPr>
+          <w:rFonts w:ascii="Consolas" w:hAnsi="Consolas"/>
+          <w:color w:val="1F2937"/>
+          <w:sz w:val="18"/>
+        </w:rPr>
+        <w:t>np</w:t>
+      </w:r>
+      <w:r>
+        <w:rPr>
+          <w:rFonts w:ascii="Consolas" w:hAnsi="Consolas"/>
+          <w:color w:val="1F2937"/>
+          <w:sz w:val="18"/>
+        </w:rPr>
+        <w:t>.</w:t>
+      </w:r>
+      <w:r>
+        <w:rPr>
+          <w:rFonts w:ascii="Consolas" w:hAnsi="Consolas"/>
+          <w:color w:val="1F2937"/>
+          <w:sz w:val="18"/>
+        </w:rPr>
+        <w:t>all</w:t>
+      </w:r>
+      <w:r>
+        <w:rPr>
+          <w:rFonts w:ascii="Consolas" w:hAnsi="Consolas"/>
+          <w:color w:val="1F2937"/>
+          <w:sz w:val="18"/>
+        </w:rPr>
+        <w:t>(</w:t>
+      </w:r>
+      <w:r>
+        <w:rPr>
+          <w:rFonts w:ascii="Consolas" w:hAnsi="Consolas"/>
+          <w:color w:val="1F2937"/>
+          <w:sz w:val="18"/>
+        </w:rPr>
+        <w:t>upper</w:t>
+      </w:r>
+      <w:r>
+        <w:rPr>
+          <w:rFonts w:ascii="Consolas" w:hAnsi="Consolas"/>
+          <w:color w:val="1F2937"/>
+          <w:sz w:val="18"/>
+        </w:rPr>
+        <w:t xml:space="preserve"> </w:t>
+      </w:r>
+      <w:r>
+        <w:rPr>
+          <w:rFonts w:ascii="Consolas" w:hAnsi="Consolas"/>
+          <w:color w:val="1F2937"/>
+          <w:sz w:val="18"/>
+        </w:rPr>
+        <w:t>&gt;</w:t>
+      </w:r>
+      <w:r>
+        <w:rPr>
+          <w:rFonts w:ascii="Consolas" w:hAnsi="Consolas"/>
+          <w:color w:val="1F2937"/>
+          <w:sz w:val="18"/>
+        </w:rPr>
+        <w:t>=</w:t>
+      </w:r>
+      <w:r>
+        <w:rPr>
+          <w:rFonts w:ascii="Consolas" w:hAnsi="Consolas"/>
+          <w:color w:val="1F2937"/>
+          <w:sz w:val="18"/>
+        </w:rPr>
+        <w:t xml:space="preserve"> </w:t>
+      </w:r>
+      <w:r>
+        <w:rPr>
+          <w:rFonts w:ascii="Consolas" w:hAnsi="Consolas"/>
+          <w:color w:val="1F2937"/>
+          <w:sz w:val="18"/>
+        </w:rPr>
+        <w:t>floors</w:t>
+      </w:r>
+      <w:r>
+        <w:rPr>
+          <w:rFonts w:ascii="Consolas" w:hAnsi="Consolas"/>
+          <w:color w:val="1F2937"/>
+          <w:sz w:val="18"/>
+        </w:rPr>
+        <w:t>)</w:t>
       </w:r>
     </w:p>
     <w:p>
       <w:pPr>
         <w:pStyle w:val="BodyText"/>
         <w:keepNext w:val="0"/>
-        <w:spacing w:before="39" w:after="120"/>
+        <w:spacing w:before="39" w:after="40"/>
         <w:ind w:left="290" w:firstLine="0"/>
       </w:pPr>
       <w:r>
         <w:rPr>
-          <w:rFonts w:ascii="Consolas" w:hAnsi="Consolas"/>
           <w:b w:val="0"/>
-          <w:sz w:val="18"/>
-        </w:rPr>
-        <w:t>result = linprog(-priority, A_ub=np.ones((1, 4)),</w:t>
+        </w:rPr>
+      </w:r>
+      <w:r>
+        <w:rPr>
+          <w:rFonts w:ascii="Consolas" w:hAnsi="Consolas"/>
+          <w:color w:val="1F2937"/>
+          <w:sz w:val="18"/>
+        </w:rPr>
+        <w:t>result</w:t>
+      </w:r>
+      <w:r>
+        <w:rPr>
+          <w:rFonts w:ascii="Consolas" w:hAnsi="Consolas"/>
+          <w:color w:val="1F2937"/>
+          <w:sz w:val="18"/>
+        </w:rPr>
+        <w:t xml:space="preserve"> </w:t>
+      </w:r>
+      <w:r>
+        <w:rPr>
+          <w:rFonts w:ascii="Consolas" w:hAnsi="Consolas"/>
+          <w:color w:val="1F2937"/>
+          <w:sz w:val="18"/>
+        </w:rPr>
+        <w:t>=</w:t>
+      </w:r>
+      <w:r>
+        <w:rPr>
+          <w:rFonts w:ascii="Consolas" w:hAnsi="Consolas"/>
+          <w:color w:val="1F2937"/>
+          <w:sz w:val="18"/>
+        </w:rPr>
+        <w:t xml:space="preserve"> </w:t>
+      </w:r>
+      <w:r>
+        <w:rPr>
+          <w:rFonts w:ascii="Consolas" w:hAnsi="Consolas"/>
+          <w:color w:val="1F2937"/>
+          <w:sz w:val="18"/>
+        </w:rPr>
+        <w:t>linprog</w:t>
+      </w:r>
+      <w:r>
+        <w:rPr>
+          <w:rFonts w:ascii="Consolas" w:hAnsi="Consolas"/>
+          <w:color w:val="1F2937"/>
+          <w:sz w:val="18"/>
+        </w:rPr>
+        <w:t>(</w:t>
+      </w:r>
+      <w:r>
+        <w:rPr>
+          <w:rFonts w:ascii="Consolas" w:hAnsi="Consolas"/>
+          <w:color w:val="1F2937"/>
+          <w:sz w:val="18"/>
+        </w:rPr>
+        <w:t>-</w:t>
+      </w:r>
+      <w:r>
+        <w:rPr>
+          <w:rFonts w:ascii="Consolas" w:hAnsi="Consolas"/>
+          <w:color w:val="1F2937"/>
+          <w:sz w:val="18"/>
+        </w:rPr>
+        <w:t>priority</w:t>
+      </w:r>
+      <w:r>
+        <w:rPr>
+          <w:rFonts w:ascii="Consolas" w:hAnsi="Consolas"/>
+          <w:color w:val="1F2937"/>
+          <w:sz w:val="18"/>
+        </w:rPr>
+        <w:t>,</w:t>
+      </w:r>
+      <w:r>
+        <w:rPr>
+          <w:rFonts w:ascii="Consolas" w:hAnsi="Consolas"/>
+          <w:color w:val="1F2937"/>
+          <w:sz w:val="18"/>
+        </w:rPr>
+        <w:t xml:space="preserve"> </w:t>
+      </w:r>
+      <w:r>
+        <w:rPr>
+          <w:rFonts w:ascii="Consolas" w:hAnsi="Consolas"/>
+          <w:color w:val="1F2937"/>
+          <w:sz w:val="18"/>
+        </w:rPr>
+        <w:t>A_ub</w:t>
+      </w:r>
+      <w:r>
+        <w:rPr>
+          <w:rFonts w:ascii="Consolas" w:hAnsi="Consolas"/>
+          <w:color w:val="1F2937"/>
+          <w:sz w:val="18"/>
+        </w:rPr>
+        <w:t>=</w:t>
+      </w:r>
+      <w:r>
+        <w:rPr>
+          <w:rFonts w:ascii="Consolas" w:hAnsi="Consolas"/>
+          <w:color w:val="1F2937"/>
+          <w:sz w:val="18"/>
+        </w:rPr>
+        <w:t>np</w:t>
+      </w:r>
+      <w:r>
+        <w:rPr>
+          <w:rFonts w:ascii="Consolas" w:hAnsi="Consolas"/>
+          <w:color w:val="1F2937"/>
+          <w:sz w:val="18"/>
+        </w:rPr>
+        <w:t>.</w:t>
+      </w:r>
+      <w:r>
+        <w:rPr>
+          <w:rFonts w:ascii="Consolas" w:hAnsi="Consolas"/>
+          <w:color w:val="1F2937"/>
+          <w:sz w:val="18"/>
+        </w:rPr>
+        <w:t>ones</w:t>
+      </w:r>
+      <w:r>
+        <w:rPr>
+          <w:rFonts w:ascii="Consolas" w:hAnsi="Consolas"/>
+          <w:color w:val="1F2937"/>
+          <w:sz w:val="18"/>
+        </w:rPr>
+        <w:t>(</w:t>
+      </w:r>
+      <w:r>
+        <w:rPr>
+          <w:rFonts w:ascii="Consolas" w:hAnsi="Consolas"/>
+          <w:color w:val="1F2937"/>
+          <w:sz w:val="18"/>
+        </w:rPr>
+        <w:t>(</w:t>
+      </w:r>
+      <w:r>
+        <w:rPr>
+          <w:rFonts w:ascii="Consolas" w:hAnsi="Consolas"/>
+          <w:color w:val="B45309"/>
+          <w:sz w:val="18"/>
+        </w:rPr>
+        <w:t>1</w:t>
+      </w:r>
+      <w:r>
+        <w:rPr>
+          <w:rFonts w:ascii="Consolas" w:hAnsi="Consolas"/>
+          <w:color w:val="1F2937"/>
+          <w:sz w:val="18"/>
+        </w:rPr>
+        <w:t>,</w:t>
+      </w:r>
+      <w:r>
+        <w:rPr>
+          <w:rFonts w:ascii="Consolas" w:hAnsi="Consolas"/>
+          <w:color w:val="1F2937"/>
+          <w:sz w:val="18"/>
+        </w:rPr>
+        <w:t xml:space="preserve"> </w:t>
+      </w:r>
+      <w:r>
+        <w:rPr>
+          <w:rFonts w:ascii="Consolas" w:hAnsi="Consolas"/>
+          <w:color w:val="B45309"/>
+          <w:sz w:val="18"/>
+        </w:rPr>
+        <w:t>4</w:t>
+      </w:r>
+      <w:r>
+        <w:rPr>
+          <w:rFonts w:ascii="Consolas" w:hAnsi="Consolas"/>
+          <w:color w:val="1F2937"/>
+          <w:sz w:val="18"/>
+        </w:rPr>
+        <w:t>)</w:t>
+      </w:r>
+      <w:r>
+        <w:rPr>
+          <w:rFonts w:ascii="Consolas" w:hAnsi="Consolas"/>
+          <w:color w:val="1F2937"/>
+          <w:sz w:val="18"/>
+        </w:rPr>
+        <w:t>)</w:t>
+      </w:r>
+      <w:r>
+        <w:rPr>
+          <w:rFonts w:ascii="Consolas" w:hAnsi="Consolas"/>
+          <w:color w:val="1F2937"/>
+          <w:sz w:val="18"/>
+        </w:rPr>
+        <w:t>,</w:t>
       </w:r>
     </w:p>
     <w:p>
       <w:pPr>
         <w:pStyle w:val="BodyText"/>
         <w:keepNext w:val="0"/>
-        <w:spacing w:before="39" w:after="120"/>
+        <w:spacing w:before="39" w:after="40"/>
         <w:ind w:left="290" w:firstLine="0"/>
       </w:pPr>
       <w:r>
         <w:rPr>
-          <w:rFonts w:ascii="Consolas" w:hAnsi="Consolas"/>
           <w:b w:val="0"/>
-          <w:sz w:val="18"/>
-        </w:rPr>
-        <w:t xml:space="preserve">                 b_ub=[supply], bounds=list(zip(floors, upper)))</w:t>
+        </w:rPr>
+      </w:r>
+      <w:r>
+        <w:rPr>
+          <w:rFonts w:ascii="Consolas" w:hAnsi="Consolas"/>
+          <w:color w:val="1F2937"/>
+          <w:sz w:val="18"/>
+        </w:rPr>
+        <w:t xml:space="preserve">                 </w:t>
+      </w:r>
+      <w:r>
+        <w:rPr>
+          <w:rFonts w:ascii="Consolas" w:hAnsi="Consolas"/>
+          <w:color w:val="1F2937"/>
+          <w:sz w:val="18"/>
+        </w:rPr>
+        <w:t>b_ub</w:t>
+      </w:r>
+      <w:r>
+        <w:rPr>
+          <w:rFonts w:ascii="Consolas" w:hAnsi="Consolas"/>
+          <w:color w:val="1F2937"/>
+          <w:sz w:val="18"/>
+        </w:rPr>
+        <w:t>=</w:t>
+      </w:r>
+      <w:r>
+        <w:rPr>
+          <w:rFonts w:ascii="Consolas" w:hAnsi="Consolas"/>
+          <w:color w:val="1F2937"/>
+          <w:sz w:val="18"/>
+        </w:rPr>
+        <w:t>[</w:t>
+      </w:r>
+      <w:r>
+        <w:rPr>
+          <w:rFonts w:ascii="Consolas" w:hAnsi="Consolas"/>
+          <w:color w:val="1F2937"/>
+          <w:sz w:val="18"/>
+        </w:rPr>
+        <w:t>supply</w:t>
+      </w:r>
+      <w:r>
+        <w:rPr>
+          <w:rFonts w:ascii="Consolas" w:hAnsi="Consolas"/>
+          <w:color w:val="1F2937"/>
+          <w:sz w:val="18"/>
+        </w:rPr>
+        <w:t>]</w:t>
+      </w:r>
+      <w:r>
+        <w:rPr>
+          <w:rFonts w:ascii="Consolas" w:hAnsi="Consolas"/>
+          <w:color w:val="1F2937"/>
+          <w:sz w:val="18"/>
+        </w:rPr>
+        <w:t>,</w:t>
+      </w:r>
+      <w:r>
+        <w:rPr>
+          <w:rFonts w:ascii="Consolas" w:hAnsi="Consolas"/>
+          <w:color w:val="1F2937"/>
+          <w:sz w:val="18"/>
+        </w:rPr>
+        <w:t xml:space="preserve"> </w:t>
+      </w:r>
+      <w:r>
+        <w:rPr>
+          <w:rFonts w:ascii="Consolas" w:hAnsi="Consolas"/>
+          <w:color w:val="1F2937"/>
+          <w:sz w:val="18"/>
+        </w:rPr>
+        <w:t>bounds</w:t>
+      </w:r>
+      <w:r>
+        <w:rPr>
+          <w:rFonts w:ascii="Consolas" w:hAnsi="Consolas"/>
+          <w:color w:val="1F2937"/>
+          <w:sz w:val="18"/>
+        </w:rPr>
+        <w:t>=</w:t>
+      </w:r>
+      <w:r>
+        <w:rPr>
+          <w:rFonts w:ascii="Consolas" w:hAnsi="Consolas"/>
+          <w:color w:val="005F99"/>
+          <w:sz w:val="18"/>
+        </w:rPr>
+        <w:t>list</w:t>
+      </w:r>
+      <w:r>
+        <w:rPr>
+          <w:rFonts w:ascii="Consolas" w:hAnsi="Consolas"/>
+          <w:color w:val="1F2937"/>
+          <w:sz w:val="18"/>
+        </w:rPr>
+        <w:t>(</w:t>
+      </w:r>
+      <w:r>
+        <w:rPr>
+          <w:rFonts w:ascii="Consolas" w:hAnsi="Consolas"/>
+          <w:color w:val="005F99"/>
+          <w:sz w:val="18"/>
+        </w:rPr>
+        <w:t>zip</w:t>
+      </w:r>
+      <w:r>
+        <w:rPr>
+          <w:rFonts w:ascii="Consolas" w:hAnsi="Consolas"/>
+          <w:color w:val="1F2937"/>
+          <w:sz w:val="18"/>
+        </w:rPr>
+        <w:t>(</w:t>
+      </w:r>
+      <w:r>
+        <w:rPr>
+          <w:rFonts w:ascii="Consolas" w:hAnsi="Consolas"/>
+          <w:color w:val="1F2937"/>
+          <w:sz w:val="18"/>
+        </w:rPr>
+        <w:t>floors</w:t>
+      </w:r>
+      <w:r>
+        <w:rPr>
+          <w:rFonts w:ascii="Consolas" w:hAnsi="Consolas"/>
+          <w:color w:val="1F2937"/>
+          <w:sz w:val="18"/>
+        </w:rPr>
+        <w:t>,</w:t>
+      </w:r>
+      <w:r>
+        <w:rPr>
+          <w:rFonts w:ascii="Consolas" w:hAnsi="Consolas"/>
+          <w:color w:val="1F2937"/>
+          <w:sz w:val="18"/>
+        </w:rPr>
+        <w:t xml:space="preserve"> </w:t>
+      </w:r>
+      <w:r>
+        <w:rPr>
+          <w:rFonts w:ascii="Consolas" w:hAnsi="Consolas"/>
+          <w:color w:val="1F2937"/>
+          <w:sz w:val="18"/>
+        </w:rPr>
+        <w:t>upper</w:t>
+      </w:r>
+      <w:r>
+        <w:rPr>
+          <w:rFonts w:ascii="Consolas" w:hAnsi="Consolas"/>
+          <w:color w:val="1F2937"/>
+          <w:sz w:val="18"/>
+        </w:rPr>
+        <w:t>)</w:t>
+      </w:r>
+      <w:r>
+        <w:rPr>
+          <w:rFonts w:ascii="Consolas" w:hAnsi="Consolas"/>
+          <w:color w:val="1F2937"/>
+          <w:sz w:val="18"/>
+        </w:rPr>
+        <w:t>)</w:t>
+      </w:r>
+      <w:r>
+        <w:rPr>
+          <w:rFonts w:ascii="Consolas" w:hAnsi="Consolas"/>
+          <w:color w:val="1F2937"/>
+          <w:sz w:val="18"/>
+        </w:rPr>
+        <w:t>)</w:t>
       </w:r>
     </w:p>
     <w:p>
@@ -5894,9 +6663,7 @@
                     <pic:cNvPicPr/>
                   </pic:nvPicPr>
                   <pic:blipFill>
-                    <a:blip r:embed="rId14">
-                      <a:grayscl/>
-                    </a:blip>
+                    <a:blip r:embed="rId14"/>
                     <a:stretch>
                       <a:fillRect/>
                     </a:stretch>
@@ -6321,9 +7088,7 @@
                     <pic:cNvPicPr/>
                   </pic:nvPicPr>
                   <pic:blipFill>
-                    <a:blip r:embed="rId15">
-                      <a:grayscl/>
-                    </a:blip>
+                    <a:blip r:embed="rId15"/>
                     <a:stretch>
                       <a:fillRect/>
                     </a:stretch>
@@ -6386,9 +7151,7 @@
                     <pic:cNvPicPr/>
                   </pic:nvPicPr>
                   <pic:blipFill>
-                    <a:blip r:embed="rId16">
-                      <a:grayscl/>
-                    </a:blip>
+                    <a:blip r:embed="rId16"/>
                     <a:stretch>
                       <a:fillRect/>
                     </a:stretch>
@@ -6480,9 +7243,7 @@
                     <pic:cNvPicPr/>
                   </pic:nvPicPr>
                   <pic:blipFill>
-                    <a:blip r:embed="rId17">
-                      <a:grayscl/>
-                    </a:blip>
+                    <a:blip r:embed="rId17"/>
                     <a:stretch>
                       <a:fillRect/>
                     </a:stretch>
@@ -7993,9 +8754,7 @@
                     <pic:cNvPicPr/>
                   </pic:nvPicPr>
                   <pic:blipFill>
-                    <a:blip r:embed="rId18">
-                      <a:grayscl/>
-                    </a:blip>
+                    <a:blip r:embed="rId18"/>
                     <a:stretch>
                       <a:fillRect/>
                     </a:stretch>
@@ -8041,6 +8800,662 @@
           <w:b w:val="0"/>
         </w:rPr>
         <w:t>The dashboard presents forecasts, model errors, weather patterns, stationarity tests, unusual demand and allocation results. Users can change the planning month, supply, sector capacity and allocation policy, then download the results as CSV files.</w:t>
+      </w:r>
+    </w:p>
+    <w:p>
+      <w:pPr>
+        <w:pStyle w:val="BodyText"/>
+        <w:keepNext w:val="0"/>
+        <w:pageBreakBefore/>
+        <w:spacing w:before="39" w:after="120"/>
+        <w:ind w:left="290" w:firstLine="0"/>
+      </w:pPr>
+      <w:r>
+        <w:rPr>
+          <w:b/>
+        </w:rPr>
+        <w:t>Notebook code and execution outputs</w:t>
+      </w:r>
+    </w:p>
+    <w:p>
+      <w:pPr>
+        <w:pStyle w:val="BodyText"/>
+        <w:keepNext w:val="0"/>
+        <w:spacing w:before="39" w:after="120"/>
+        <w:ind w:left="290" w:firstLine="0"/>
+      </w:pPr>
+      <w:r>
+        <w:rPr>
+          <w:b w:val="0"/>
+        </w:rPr>
+        <w:t>notebooks/Urban_Water_Forecasting_Colab.ipynb contains the executable analysis and saved outputs. In Google Colab, select Runtime then Run all. Setup clones the public project and installs its dependencies. Subsequent cells reproduce preprocessing, forecasts, ADF diagnostics, anomaly alerts and allocation scenarios from the source snapshots. The submitted outputs were executed locally with a Jupyter kernel; the notebook includes setup for Colab execution.</w:t>
+      </w:r>
+    </w:p>
+    <w:p>
+      <w:pPr>
+        <w:pStyle w:val="BodyText"/>
+        <w:keepNext w:val="0"/>
+        <w:spacing w:before="39" w:after="40"/>
+        <w:ind w:left="290" w:firstLine="0"/>
+      </w:pPr>
+      <w:r>
+        <w:rPr>
+          <w:b w:val="0"/>
+        </w:rPr>
+      </w:r>
+      <w:r>
+        <w:rPr>
+          <w:rFonts w:ascii="Consolas" w:hAnsi="Consolas"/>
+          <w:color w:val="7C3AED"/>
+          <w:sz w:val="18"/>
+        </w:rPr>
+        <w:t>from</w:t>
+      </w:r>
+      <w:r>
+        <w:rPr>
+          <w:rFonts w:ascii="Consolas" w:hAnsi="Consolas"/>
+          <w:color w:val="1F2937"/>
+          <w:sz w:val="18"/>
+        </w:rPr>
+        <w:t xml:space="preserve"> </w:t>
+      </w:r>
+      <w:r>
+        <w:rPr>
+          <w:rFonts w:ascii="Consolas" w:hAnsi="Consolas"/>
+          <w:color w:val="1F2937"/>
+          <w:sz w:val="18"/>
+        </w:rPr>
+        <w:t>src</w:t>
+      </w:r>
+      <w:r>
+        <w:rPr>
+          <w:rFonts w:ascii="Consolas" w:hAnsi="Consolas"/>
+          <w:color w:val="1F2937"/>
+          <w:sz w:val="18"/>
+        </w:rPr>
+        <w:t>.</w:t>
+      </w:r>
+      <w:r>
+        <w:rPr>
+          <w:rFonts w:ascii="Consolas" w:hAnsi="Consolas"/>
+          <w:color w:val="1F2937"/>
+          <w:sz w:val="18"/>
+        </w:rPr>
+        <w:t>pipeline</w:t>
+      </w:r>
+      <w:r>
+        <w:rPr>
+          <w:rFonts w:ascii="Consolas" w:hAnsi="Consolas"/>
+          <w:color w:val="1F2937"/>
+          <w:sz w:val="18"/>
+        </w:rPr>
+        <w:t xml:space="preserve"> </w:t>
+      </w:r>
+      <w:r>
+        <w:rPr>
+          <w:rFonts w:ascii="Consolas" w:hAnsi="Consolas"/>
+          <w:color w:val="7C3AED"/>
+          <w:sz w:val="18"/>
+        </w:rPr>
+        <w:t>import</w:t>
+      </w:r>
+      <w:r>
+        <w:rPr>
+          <w:rFonts w:ascii="Consolas" w:hAnsi="Consolas"/>
+          <w:color w:val="1F2937"/>
+          <w:sz w:val="18"/>
+        </w:rPr>
+        <w:t xml:space="preserve"> </w:t>
+      </w:r>
+      <w:r>
+        <w:rPr>
+          <w:rFonts w:ascii="Consolas" w:hAnsi="Consolas"/>
+          <w:color w:val="1F2937"/>
+          <w:sz w:val="18"/>
+        </w:rPr>
+        <w:t>run</w:t>
+      </w:r>
+    </w:p>
+    <w:p>
+      <w:pPr>
+        <w:pStyle w:val="BodyText"/>
+        <w:keepNext w:val="0"/>
+        <w:spacing w:before="39" w:after="40"/>
+        <w:ind w:left="290" w:firstLine="0"/>
+      </w:pPr>
+      <w:r>
+        <w:rPr>
+          <w:b w:val="0"/>
+        </w:rPr>
+      </w:r>
+      <w:r>
+        <w:rPr>
+          <w:rFonts w:ascii="Consolas" w:hAnsi="Consolas"/>
+          <w:color w:val="1F2937"/>
+          <w:sz w:val="18"/>
+        </w:rPr>
+        <w:t>run</w:t>
+      </w:r>
+      <w:r>
+        <w:rPr>
+          <w:rFonts w:ascii="Consolas" w:hAnsi="Consolas"/>
+          <w:color w:val="1F2937"/>
+          <w:sz w:val="18"/>
+        </w:rPr>
+        <w:t>(</w:t>
+      </w:r>
+      <w:r>
+        <w:rPr>
+          <w:rFonts w:ascii="Consolas" w:hAnsi="Consolas"/>
+          <w:color w:val="1F2937"/>
+          <w:sz w:val="18"/>
+        </w:rPr>
+        <w:t>)</w:t>
+      </w:r>
+    </w:p>
+    <w:p>
+      <w:pPr>
+        <w:pStyle w:val="BodyText"/>
+        <w:keepNext w:val="0"/>
+        <w:spacing w:before="39" w:after="40"/>
+        <w:ind w:left="290" w:firstLine="0"/>
+      </w:pPr>
+      <w:r>
+        <w:rPr>
+          <w:b w:val="0"/>
+        </w:rPr>
+      </w:r>
+      <w:r>
+        <w:rPr>
+          <w:rFonts w:ascii="Consolas" w:hAnsi="Consolas"/>
+          <w:color w:val="1F2937"/>
+          <w:sz w:val="18"/>
+        </w:rPr>
+        <w:t>comparison</w:t>
+      </w:r>
+      <w:r>
+        <w:rPr>
+          <w:rFonts w:ascii="Consolas" w:hAnsi="Consolas"/>
+          <w:color w:val="1F2937"/>
+          <w:sz w:val="18"/>
+        </w:rPr>
+        <w:t xml:space="preserve"> </w:t>
+      </w:r>
+      <w:r>
+        <w:rPr>
+          <w:rFonts w:ascii="Consolas" w:hAnsi="Consolas"/>
+          <w:color w:val="1F2937"/>
+          <w:sz w:val="18"/>
+        </w:rPr>
+        <w:t>=</w:t>
+      </w:r>
+      <w:r>
+        <w:rPr>
+          <w:rFonts w:ascii="Consolas" w:hAnsi="Consolas"/>
+          <w:color w:val="1F2937"/>
+          <w:sz w:val="18"/>
+        </w:rPr>
+        <w:t xml:space="preserve"> </w:t>
+      </w:r>
+      <w:r>
+        <w:rPr>
+          <w:rFonts w:ascii="Consolas" w:hAnsi="Consolas"/>
+          <w:color w:val="1F2937"/>
+          <w:sz w:val="18"/>
+        </w:rPr>
+        <w:t>pd</w:t>
+      </w:r>
+      <w:r>
+        <w:rPr>
+          <w:rFonts w:ascii="Consolas" w:hAnsi="Consolas"/>
+          <w:color w:val="1F2937"/>
+          <w:sz w:val="18"/>
+        </w:rPr>
+        <w:t>.</w:t>
+      </w:r>
+      <w:r>
+        <w:rPr>
+          <w:rFonts w:ascii="Consolas" w:hAnsi="Consolas"/>
+          <w:color w:val="1F2937"/>
+          <w:sz w:val="18"/>
+        </w:rPr>
+        <w:t>read_csv</w:t>
+      </w:r>
+      <w:r>
+        <w:rPr>
+          <w:rFonts w:ascii="Consolas" w:hAnsi="Consolas"/>
+          <w:color w:val="1F2937"/>
+          <w:sz w:val="18"/>
+        </w:rPr>
+        <w:t>(</w:t>
+      </w:r>
+      <w:r>
+        <w:rPr>
+          <w:rFonts w:ascii="Consolas" w:hAnsi="Consolas"/>
+          <w:color w:val="18743B"/>
+          <w:sz w:val="18"/>
+        </w:rPr>
+        <w:t>"</w:t>
+      </w:r>
+      <w:r>
+        <w:rPr>
+          <w:rFonts w:ascii="Consolas" w:hAnsi="Consolas"/>
+          <w:color w:val="18743B"/>
+          <w:sz w:val="18"/>
+        </w:rPr>
+        <w:t>results/metrics.csv</w:t>
+      </w:r>
+      <w:r>
+        <w:rPr>
+          <w:rFonts w:ascii="Consolas" w:hAnsi="Consolas"/>
+          <w:color w:val="18743B"/>
+          <w:sz w:val="18"/>
+        </w:rPr>
+        <w:t>"</w:t>
+      </w:r>
+      <w:r>
+        <w:rPr>
+          <w:rFonts w:ascii="Consolas" w:hAnsi="Consolas"/>
+          <w:color w:val="1F2937"/>
+          <w:sz w:val="18"/>
+        </w:rPr>
+        <w:t>)</w:t>
+      </w:r>
+    </w:p>
+    <w:p>
+      <w:pPr>
+        <w:pStyle w:val="BodyText"/>
+        <w:keepNext w:val="0"/>
+        <w:spacing w:before="39" w:after="40"/>
+        <w:ind w:left="290" w:firstLine="0"/>
+      </w:pPr>
+      <w:r>
+        <w:rPr>
+          <w:b w:val="0"/>
+        </w:rPr>
+      </w:r>
+      <w:r>
+        <w:rPr>
+          <w:rFonts w:ascii="Consolas" w:hAnsi="Consolas"/>
+          <w:color w:val="1F2937"/>
+          <w:sz w:val="18"/>
+        </w:rPr>
+        <w:t>display</w:t>
+      </w:r>
+      <w:r>
+        <w:rPr>
+          <w:rFonts w:ascii="Consolas" w:hAnsi="Consolas"/>
+          <w:color w:val="1F2937"/>
+          <w:sz w:val="18"/>
+        </w:rPr>
+        <w:t>(</w:t>
+      </w:r>
+      <w:r>
+        <w:rPr>
+          <w:rFonts w:ascii="Consolas" w:hAnsi="Consolas"/>
+          <w:color w:val="1F2937"/>
+          <w:sz w:val="18"/>
+        </w:rPr>
+        <w:t>comparison</w:t>
+      </w:r>
+      <w:r>
+        <w:rPr>
+          <w:rFonts w:ascii="Consolas" w:hAnsi="Consolas"/>
+          <w:color w:val="1F2937"/>
+          <w:sz w:val="18"/>
+        </w:rPr>
+        <w:t>.</w:t>
+      </w:r>
+      <w:r>
+        <w:rPr>
+          <w:rFonts w:ascii="Consolas" w:hAnsi="Consolas"/>
+          <w:color w:val="1F2937"/>
+          <w:sz w:val="18"/>
+        </w:rPr>
+        <w:t>round</w:t>
+      </w:r>
+      <w:r>
+        <w:rPr>
+          <w:rFonts w:ascii="Consolas" w:hAnsi="Consolas"/>
+          <w:color w:val="1F2937"/>
+          <w:sz w:val="18"/>
+        </w:rPr>
+        <w:t>(</w:t>
+      </w:r>
+      <w:r>
+        <w:rPr>
+          <w:rFonts w:ascii="Consolas" w:hAnsi="Consolas"/>
+          <w:color w:val="B45309"/>
+          <w:sz w:val="18"/>
+        </w:rPr>
+        <w:t>2</w:t>
+      </w:r>
+      <w:r>
+        <w:rPr>
+          <w:rFonts w:ascii="Consolas" w:hAnsi="Consolas"/>
+          <w:color w:val="1F2937"/>
+          <w:sz w:val="18"/>
+        </w:rPr>
+        <w:t>)</w:t>
+      </w:r>
+      <w:r>
+        <w:rPr>
+          <w:rFonts w:ascii="Consolas" w:hAnsi="Consolas"/>
+          <w:color w:val="1F2937"/>
+          <w:sz w:val="18"/>
+        </w:rPr>
+        <w:t>)</w:t>
+      </w:r>
+    </w:p>
+    <w:p>
+      <w:pPr>
+        <w:pStyle w:val="BodyText"/>
+        <w:keepNext w:val="0"/>
+        <w:spacing w:before="39" w:after="40"/>
+        <w:ind w:left="290" w:firstLine="0"/>
+      </w:pPr>
+      <w:r>
+        <w:rPr>
+          <w:b w:val="0"/>
+        </w:rPr>
+      </w:r>
+      <w:r>
+        <w:rPr>
+          <w:rFonts w:ascii="Consolas" w:hAnsi="Consolas"/>
+          <w:color w:val="1F2937"/>
+          <w:sz w:val="18"/>
+        </w:rPr>
+        <w:t>alerts</w:t>
+      </w:r>
+      <w:r>
+        <w:rPr>
+          <w:rFonts w:ascii="Consolas" w:hAnsi="Consolas"/>
+          <w:color w:val="1F2937"/>
+          <w:sz w:val="18"/>
+        </w:rPr>
+        <w:t xml:space="preserve"> </w:t>
+      </w:r>
+      <w:r>
+        <w:rPr>
+          <w:rFonts w:ascii="Consolas" w:hAnsi="Consolas"/>
+          <w:color w:val="1F2937"/>
+          <w:sz w:val="18"/>
+        </w:rPr>
+        <w:t>=</w:t>
+      </w:r>
+      <w:r>
+        <w:rPr>
+          <w:rFonts w:ascii="Consolas" w:hAnsi="Consolas"/>
+          <w:color w:val="1F2937"/>
+          <w:sz w:val="18"/>
+        </w:rPr>
+        <w:t xml:space="preserve"> </w:t>
+      </w:r>
+      <w:r>
+        <w:rPr>
+          <w:rFonts w:ascii="Consolas" w:hAnsi="Consolas"/>
+          <w:color w:val="1F2937"/>
+          <w:sz w:val="18"/>
+        </w:rPr>
+        <w:t>pd</w:t>
+      </w:r>
+      <w:r>
+        <w:rPr>
+          <w:rFonts w:ascii="Consolas" w:hAnsi="Consolas"/>
+          <w:color w:val="1F2937"/>
+          <w:sz w:val="18"/>
+        </w:rPr>
+        <w:t>.</w:t>
+      </w:r>
+      <w:r>
+        <w:rPr>
+          <w:rFonts w:ascii="Consolas" w:hAnsi="Consolas"/>
+          <w:color w:val="1F2937"/>
+          <w:sz w:val="18"/>
+        </w:rPr>
+        <w:t>read_csv</w:t>
+      </w:r>
+      <w:r>
+        <w:rPr>
+          <w:rFonts w:ascii="Consolas" w:hAnsi="Consolas"/>
+          <w:color w:val="1F2937"/>
+          <w:sz w:val="18"/>
+        </w:rPr>
+        <w:t>(</w:t>
+      </w:r>
+      <w:r>
+        <w:rPr>
+          <w:rFonts w:ascii="Consolas" w:hAnsi="Consolas"/>
+          <w:color w:val="18743B"/>
+          <w:sz w:val="18"/>
+        </w:rPr>
+        <w:t>"</w:t>
+      </w:r>
+      <w:r>
+        <w:rPr>
+          <w:rFonts w:ascii="Consolas" w:hAnsi="Consolas"/>
+          <w:color w:val="18743B"/>
+          <w:sz w:val="18"/>
+        </w:rPr>
+        <w:t>results/anomalies.csv</w:t>
+      </w:r>
+      <w:r>
+        <w:rPr>
+          <w:rFonts w:ascii="Consolas" w:hAnsi="Consolas"/>
+          <w:color w:val="18743B"/>
+          <w:sz w:val="18"/>
+        </w:rPr>
+        <w:t>"</w:t>
+      </w:r>
+      <w:r>
+        <w:rPr>
+          <w:rFonts w:ascii="Consolas" w:hAnsi="Consolas"/>
+          <w:color w:val="1F2937"/>
+          <w:sz w:val="18"/>
+        </w:rPr>
+        <w:t>)</w:t>
+      </w:r>
+    </w:p>
+    <w:p>
+      <w:pPr>
+        <w:pStyle w:val="BodyText"/>
+        <w:keepNext w:val="0"/>
+        <w:spacing w:before="39" w:after="40"/>
+        <w:ind w:left="290" w:firstLine="0"/>
+      </w:pPr>
+      <w:r>
+        <w:rPr>
+          <w:b w:val="0"/>
+        </w:rPr>
+      </w:r>
+      <w:r>
+        <w:rPr>
+          <w:rFonts w:ascii="Consolas" w:hAnsi="Consolas"/>
+          <w:color w:val="1F2937"/>
+          <w:sz w:val="18"/>
+        </w:rPr>
+        <w:t>display</w:t>
+      </w:r>
+      <w:r>
+        <w:rPr>
+          <w:rFonts w:ascii="Consolas" w:hAnsi="Consolas"/>
+          <w:color w:val="1F2937"/>
+          <w:sz w:val="18"/>
+        </w:rPr>
+        <w:t>(</w:t>
+      </w:r>
+      <w:r>
+        <w:rPr>
+          <w:rFonts w:ascii="Consolas" w:hAnsi="Consolas"/>
+          <w:color w:val="1F2937"/>
+          <w:sz w:val="18"/>
+        </w:rPr>
+        <w:t>alerts</w:t>
+      </w:r>
+      <w:r>
+        <w:rPr>
+          <w:rFonts w:ascii="Consolas" w:hAnsi="Consolas"/>
+          <w:color w:val="1F2937"/>
+          <w:sz w:val="18"/>
+        </w:rPr>
+        <w:t>.</w:t>
+      </w:r>
+      <w:r>
+        <w:rPr>
+          <w:rFonts w:ascii="Consolas" w:hAnsi="Consolas"/>
+          <w:color w:val="1F2937"/>
+          <w:sz w:val="18"/>
+        </w:rPr>
+        <w:t>loc</w:t>
+      </w:r>
+      <w:r>
+        <w:rPr>
+          <w:rFonts w:ascii="Consolas" w:hAnsi="Consolas"/>
+          <w:color w:val="1F2937"/>
+          <w:sz w:val="18"/>
+        </w:rPr>
+        <w:t>[</w:t>
+      </w:r>
+      <w:r>
+        <w:rPr>
+          <w:rFonts w:ascii="Consolas" w:hAnsi="Consolas"/>
+          <w:color w:val="1F2937"/>
+          <w:sz w:val="18"/>
+        </w:rPr>
+        <w:t>alerts</w:t>
+      </w:r>
+      <w:r>
+        <w:rPr>
+          <w:rFonts w:ascii="Consolas" w:hAnsi="Consolas"/>
+          <w:color w:val="1F2937"/>
+          <w:sz w:val="18"/>
+        </w:rPr>
+        <w:t>[</w:t>
+      </w:r>
+      <w:r>
+        <w:rPr>
+          <w:rFonts w:ascii="Consolas" w:hAnsi="Consolas"/>
+          <w:color w:val="18743B"/>
+          <w:sz w:val="18"/>
+        </w:rPr>
+        <w:t>"</w:t>
+      </w:r>
+      <w:r>
+        <w:rPr>
+          <w:rFonts w:ascii="Consolas" w:hAnsi="Consolas"/>
+          <w:color w:val="18743B"/>
+          <w:sz w:val="18"/>
+        </w:rPr>
+        <w:t>flag</w:t>
+      </w:r>
+      <w:r>
+        <w:rPr>
+          <w:rFonts w:ascii="Consolas" w:hAnsi="Consolas"/>
+          <w:color w:val="18743B"/>
+          <w:sz w:val="18"/>
+        </w:rPr>
+        <w:t>"</w:t>
+      </w:r>
+      <w:r>
+        <w:rPr>
+          <w:rFonts w:ascii="Consolas" w:hAnsi="Consolas"/>
+          <w:color w:val="1F2937"/>
+          <w:sz w:val="18"/>
+        </w:rPr>
+        <w:t>]</w:t>
+      </w:r>
+      <w:r>
+        <w:rPr>
+          <w:rFonts w:ascii="Consolas" w:hAnsi="Consolas"/>
+          <w:color w:val="1F2937"/>
+          <w:sz w:val="18"/>
+        </w:rPr>
+        <w:t>]</w:t>
+      </w:r>
+      <w:r>
+        <w:rPr>
+          <w:rFonts w:ascii="Consolas" w:hAnsi="Consolas"/>
+          <w:color w:val="1F2937"/>
+          <w:sz w:val="18"/>
+        </w:rPr>
+        <w:t>)</w:t>
+      </w:r>
+    </w:p>
+    <w:p>
+      <w:pPr>
+        <w:pStyle w:val="BodyText"/>
+        <w:keepNext/>
+        <w:spacing w:before="39" w:after="120"/>
+        <w:ind w:left="290" w:firstLine="0"/>
+        <w:jc w:val="center"/>
+      </w:pPr>
+      <w:r>
+        <w:rPr>
+          <w:b w:val="0"/>
+        </w:rPr>
+      </w:r>
+      <w:r>
+        <w:drawing>
+          <wp:inline>
+            <wp:extent cx="6217920" cy="2710725"/>
+            <wp:docPr id="17" name="Picture 17"/>
+            <wp:cNvGraphicFramePr>
+              <a:graphicFrameLocks noChangeAspect="1"/>
+            </wp:cNvGraphicFramePr>
+            <a:graphic>
+              <a:graphicData uri="http://schemas.openxmlformats.org/drawingml/2006/picture">
+                <pic:pic>
+                  <pic:nvPicPr>
+                    <pic:cNvPr id="0" name="notebook_output.png"/>
+                    <pic:cNvPicPr/>
+                  </pic:nvPicPr>
+                  <pic:blipFill>
+                    <a:blip r:embed="rId19"/>
+                    <a:stretch>
+                      <a:fillRect/>
+                    </a:stretch>
+                  </pic:blipFill>
+                  <pic:spPr>
+                    <a:xfrm>
+                      <a:off x="0" y="0"/>
+                      <a:ext cx="6217920" cy="2710725"/>
+                    </a:xfrm>
+                    <a:prstGeom prst="rect"/>
+                  </pic:spPr>
+                </pic:pic>
+              </a:graphicData>
+            </a:graphic>
+          </wp:inline>
+        </w:drawing>
+      </w:r>
+    </w:p>
+    <w:p>
+      <w:pPr>
+        <w:pStyle w:val="BodyText"/>
+        <w:keepNext w:val="0"/>
+        <w:spacing w:before="39" w:after="120"/>
+        <w:ind w:left="290" w:firstLine="0"/>
+        <w:jc w:val="center"/>
+      </w:pPr>
+      <w:r>
+        <w:rPr>
+          <w:b w:val="0"/>
+        </w:rPr>
+        <w:t>Figure 7  Executed notebook output showing forecast errors and anomaly alerts</w:t>
+      </w:r>
+    </w:p>
+    <w:p>
+      <w:pPr>
+        <w:pStyle w:val="BodyText"/>
+        <w:keepNext w:val="0"/>
+        <w:spacing w:before="39" w:after="120"/>
+        <w:ind w:left="290" w:firstLine="0"/>
+      </w:pPr>
+      <w:r>
+        <w:rPr>
+          <w:b w:val="0"/>
+        </w:rPr>
+        <w:t>The notebook saves tables and color plots in its output cells. results/notebook_outputs.md provides a separate readable record of metrics, ADF results, alerts, allocation comparisons and test output. Re-running uses the same chronological split and validation selection rule as the dashboard.</w:t>
       </w:r>
     </w:p>
     <w:p>
@@ -9066,6 +10481,246 @@
                 <w:sz w:val="18"/>
               </w:rPr>
               <w:t>10. ____________________</w:t>
+            </w:r>
+          </w:p>
+        </w:tc>
+        <w:tc>
+          <w:tcPr>
+            <w:tcW w:type="dxa" w:w="2880"/>
+            <w:shd w:fill="FFFFFF" w:color="000000"/>
+            <w:tcMar>
+              <w:top w:w="70" w:type="dxa"/>
+              <w:left w:w="70" w:type="dxa"/>
+              <w:bottom w:w="70" w:type="dxa"/>
+              <w:right w:w="70" w:type="dxa"/>
+            </w:tcMar>
+          </w:tcPr>
+          <w:p>
+            <w:pPr>
+              <w:keepNext w:val="0"/>
+              <w:spacing w:after="40" w:before="40"/>
+            </w:pPr>
+            <w:r>
+              <w:rPr>
+                <w:b w:val="0"/>
+                <w:sz w:val="18"/>
+              </w:rPr>
+              <w:t>____________________</w:t>
+            </w:r>
+          </w:p>
+        </w:tc>
+        <w:tc>
+          <w:tcPr>
+            <w:tcW w:type="dxa" w:w="3744"/>
+            <w:shd w:fill="FFFFFF" w:color="000000"/>
+            <w:tcMar>
+              <w:top w:w="70" w:type="dxa"/>
+              <w:left w:w="70" w:type="dxa"/>
+              <w:bottom w:w="70" w:type="dxa"/>
+              <w:right w:w="70" w:type="dxa"/>
+            </w:tcMar>
+          </w:tcPr>
+          <w:p>
+            <w:pPr>
+              <w:keepNext w:val="0"/>
+              <w:spacing w:after="40" w:before="40"/>
+            </w:pPr>
+            <w:r>
+              <w:rPr>
+                <w:b w:val="0"/>
+                <w:sz w:val="18"/>
+              </w:rPr>
+              <w:t>____________________________</w:t>
+            </w:r>
+          </w:p>
+        </w:tc>
+      </w:tr>
+      <w:tr>
+        <w:trPr>
+          <w:cantSplit/>
+        </w:trPr>
+        <w:tc>
+          <w:tcPr>
+            <w:tcW w:type="dxa" w:w="3456"/>
+            <w:shd w:fill="FFFFFF" w:color="000000"/>
+            <w:tcMar>
+              <w:top w:w="70" w:type="dxa"/>
+              <w:left w:w="70" w:type="dxa"/>
+              <w:bottom w:w="70" w:type="dxa"/>
+              <w:right w:w="70" w:type="dxa"/>
+            </w:tcMar>
+          </w:tcPr>
+          <w:p>
+            <w:pPr>
+              <w:keepNext w:val="0"/>
+              <w:spacing w:after="40" w:before="40"/>
+            </w:pPr>
+            <w:r>
+              <w:rPr>
+                <w:b w:val="0"/>
+                <w:sz w:val="18"/>
+              </w:rPr>
+              <w:t>11. ____________________</w:t>
+            </w:r>
+          </w:p>
+        </w:tc>
+        <w:tc>
+          <w:tcPr>
+            <w:tcW w:type="dxa" w:w="2880"/>
+            <w:shd w:fill="FFFFFF" w:color="000000"/>
+            <w:tcMar>
+              <w:top w:w="70" w:type="dxa"/>
+              <w:left w:w="70" w:type="dxa"/>
+              <w:bottom w:w="70" w:type="dxa"/>
+              <w:right w:w="70" w:type="dxa"/>
+            </w:tcMar>
+          </w:tcPr>
+          <w:p>
+            <w:pPr>
+              <w:keepNext w:val="0"/>
+              <w:spacing w:after="40" w:before="40"/>
+            </w:pPr>
+            <w:r>
+              <w:rPr>
+                <w:b w:val="0"/>
+                <w:sz w:val="18"/>
+              </w:rPr>
+              <w:t>____________________</w:t>
+            </w:r>
+          </w:p>
+        </w:tc>
+        <w:tc>
+          <w:tcPr>
+            <w:tcW w:type="dxa" w:w="3744"/>
+            <w:shd w:fill="FFFFFF" w:color="000000"/>
+            <w:tcMar>
+              <w:top w:w="70" w:type="dxa"/>
+              <w:left w:w="70" w:type="dxa"/>
+              <w:bottom w:w="70" w:type="dxa"/>
+              <w:right w:w="70" w:type="dxa"/>
+            </w:tcMar>
+          </w:tcPr>
+          <w:p>
+            <w:pPr>
+              <w:keepNext w:val="0"/>
+              <w:spacing w:after="40" w:before="40"/>
+            </w:pPr>
+            <w:r>
+              <w:rPr>
+                <w:b w:val="0"/>
+                <w:sz w:val="18"/>
+              </w:rPr>
+              <w:t>____________________________</w:t>
+            </w:r>
+          </w:p>
+        </w:tc>
+      </w:tr>
+      <w:tr>
+        <w:trPr>
+          <w:cantSplit/>
+        </w:trPr>
+        <w:tc>
+          <w:tcPr>
+            <w:tcW w:type="dxa" w:w="3456"/>
+            <w:shd w:fill="FFFFFF" w:color="000000"/>
+            <w:tcMar>
+              <w:top w:w="70" w:type="dxa"/>
+              <w:left w:w="70" w:type="dxa"/>
+              <w:bottom w:w="70" w:type="dxa"/>
+              <w:right w:w="70" w:type="dxa"/>
+            </w:tcMar>
+          </w:tcPr>
+          <w:p>
+            <w:pPr>
+              <w:keepNext w:val="0"/>
+              <w:spacing w:after="40" w:before="40"/>
+            </w:pPr>
+            <w:r>
+              <w:rPr>
+                <w:b w:val="0"/>
+                <w:sz w:val="18"/>
+              </w:rPr>
+              <w:t>12. ____________________</w:t>
+            </w:r>
+          </w:p>
+        </w:tc>
+        <w:tc>
+          <w:tcPr>
+            <w:tcW w:type="dxa" w:w="2880"/>
+            <w:shd w:fill="FFFFFF" w:color="000000"/>
+            <w:tcMar>
+              <w:top w:w="70" w:type="dxa"/>
+              <w:left w:w="70" w:type="dxa"/>
+              <w:bottom w:w="70" w:type="dxa"/>
+              <w:right w:w="70" w:type="dxa"/>
+            </w:tcMar>
+          </w:tcPr>
+          <w:p>
+            <w:pPr>
+              <w:keepNext w:val="0"/>
+              <w:spacing w:after="40" w:before="40"/>
+            </w:pPr>
+            <w:r>
+              <w:rPr>
+                <w:b w:val="0"/>
+                <w:sz w:val="18"/>
+              </w:rPr>
+              <w:t>____________________</w:t>
+            </w:r>
+          </w:p>
+        </w:tc>
+        <w:tc>
+          <w:tcPr>
+            <w:tcW w:type="dxa" w:w="3744"/>
+            <w:shd w:fill="FFFFFF" w:color="000000"/>
+            <w:tcMar>
+              <w:top w:w="70" w:type="dxa"/>
+              <w:left w:w="70" w:type="dxa"/>
+              <w:bottom w:w="70" w:type="dxa"/>
+              <w:right w:w="70" w:type="dxa"/>
+            </w:tcMar>
+          </w:tcPr>
+          <w:p>
+            <w:pPr>
+              <w:keepNext w:val="0"/>
+              <w:spacing w:after="40" w:before="40"/>
+            </w:pPr>
+            <w:r>
+              <w:rPr>
+                <w:b w:val="0"/>
+                <w:sz w:val="18"/>
+              </w:rPr>
+              <w:t>____________________________</w:t>
+            </w:r>
+          </w:p>
+        </w:tc>
+      </w:tr>
+      <w:tr>
+        <w:trPr>
+          <w:cantSplit/>
+        </w:trPr>
+        <w:tc>
+          <w:tcPr>
+            <w:tcW w:type="dxa" w:w="3456"/>
+            <w:shd w:fill="FFFFFF" w:color="000000"/>
+            <w:tcMar>
+              <w:top w:w="70" w:type="dxa"/>
+              <w:left w:w="70" w:type="dxa"/>
+              <w:bottom w:w="70" w:type="dxa"/>
+              <w:right w:w="70" w:type="dxa"/>
+            </w:tcMar>
+          </w:tcPr>
+          <w:p>
+            <w:pPr>
+              <w:keepNext w:val="0"/>
+              <w:spacing w:after="40" w:before="40"/>
+            </w:pPr>
+            <w:r>
+              <w:rPr>
+                <w:b w:val="0"/>
+                <w:sz w:val="18"/>
+              </w:rPr>
+              <w:t>13. ____________________</w:t>
             </w:r>
           </w:p>
         </w:tc>
@@ -9843,9 +11498,7 @@
                   <pic:cNvPicPr/>
                 </pic:nvPicPr>
                 <pic:blipFill>
-                  <a:blip r:embed="rId1" cstate="print">
-                    <a:grayscl/>
-                  </a:blip>
+                  <a:blip r:embed="rId1" cstate="print"/>
                   <a:stretch>
                     <a:fillRect/>
                   </a:stretch>

</xml_diff>

<commit_message>
Replace report figures with native UHD dashboard and real Colab captures
</commit_message>
<xml_diff>
--- a/docs/CEP_Report.docx
+++ b/docs/CEP_Report.docx
@@ -8741,7 +8741,7 @@
       <w:r>
         <w:drawing>
           <wp:inline>
-            <wp:extent cx="6217920" cy="3229626"/>
+            <wp:extent cx="6217920" cy="5182950"/>
             <wp:docPr id="16" name="Picture 16"/>
             <wp:cNvGraphicFramePr>
               <a:graphicFrameLocks noChangeAspect="1"/>
@@ -8750,7 +8750,7 @@
               <a:graphicData uri="http://schemas.openxmlformats.org/drawingml/2006/picture">
                 <pic:pic>
                   <pic:nvPicPr>
-                    <pic:cNvPr id="0" name="dashboard_allocation.png"/>
+                    <pic:cNvPr id="0" name="dashboard_allocation_uhd.jpg"/>
                     <pic:cNvPicPr/>
                   </pic:nvPicPr>
                   <pic:blipFill>
@@ -8762,7 +8762,7 @@
                   <pic:spPr>
                     <a:xfrm>
                       <a:off x="0" y="0"/>
-                      <a:ext cx="6217920" cy="3229626"/>
+                      <a:ext cx="6217920" cy="5182950"/>
                     </a:xfrm>
                     <a:prstGeom prst="rect"/>
                   </pic:spPr>
@@ -8785,7 +8785,7 @@
         <w:rPr>
           <w:b w:val="0"/>
         </w:rPr>
-        <w:t>Figure 6  Dashboard showing the 75 percent supply scenario</w:t>
+        <w:t>Figure 6  Live dashboard showing the complete 75 percent supply scenario</w:t>
       </w:r>
     </w:p>
     <w:p>
@@ -8834,556 +8834,6 @@
     <w:p>
       <w:pPr>
         <w:pStyle w:val="BodyText"/>
-        <w:keepNext w:val="0"/>
-        <w:spacing w:before="39" w:after="40"/>
-        <w:ind w:left="290" w:firstLine="0"/>
-      </w:pPr>
-      <w:r>
-        <w:rPr>
-          <w:b w:val="0"/>
-        </w:rPr>
-      </w:r>
-      <w:r>
-        <w:rPr>
-          <w:rFonts w:ascii="Consolas" w:hAnsi="Consolas"/>
-          <w:color w:val="7C3AED"/>
-          <w:sz w:val="18"/>
-        </w:rPr>
-        <w:t>from</w:t>
-      </w:r>
-      <w:r>
-        <w:rPr>
-          <w:rFonts w:ascii="Consolas" w:hAnsi="Consolas"/>
-          <w:color w:val="1F2937"/>
-          <w:sz w:val="18"/>
-        </w:rPr>
-        <w:t xml:space="preserve"> </w:t>
-      </w:r>
-      <w:r>
-        <w:rPr>
-          <w:rFonts w:ascii="Consolas" w:hAnsi="Consolas"/>
-          <w:color w:val="1F2937"/>
-          <w:sz w:val="18"/>
-        </w:rPr>
-        <w:t>src</w:t>
-      </w:r>
-      <w:r>
-        <w:rPr>
-          <w:rFonts w:ascii="Consolas" w:hAnsi="Consolas"/>
-          <w:color w:val="1F2937"/>
-          <w:sz w:val="18"/>
-        </w:rPr>
-        <w:t>.</w:t>
-      </w:r>
-      <w:r>
-        <w:rPr>
-          <w:rFonts w:ascii="Consolas" w:hAnsi="Consolas"/>
-          <w:color w:val="1F2937"/>
-          <w:sz w:val="18"/>
-        </w:rPr>
-        <w:t>pipeline</w:t>
-      </w:r>
-      <w:r>
-        <w:rPr>
-          <w:rFonts w:ascii="Consolas" w:hAnsi="Consolas"/>
-          <w:color w:val="1F2937"/>
-          <w:sz w:val="18"/>
-        </w:rPr>
-        <w:t xml:space="preserve"> </w:t>
-      </w:r>
-      <w:r>
-        <w:rPr>
-          <w:rFonts w:ascii="Consolas" w:hAnsi="Consolas"/>
-          <w:color w:val="7C3AED"/>
-          <w:sz w:val="18"/>
-        </w:rPr>
-        <w:t>import</w:t>
-      </w:r>
-      <w:r>
-        <w:rPr>
-          <w:rFonts w:ascii="Consolas" w:hAnsi="Consolas"/>
-          <w:color w:val="1F2937"/>
-          <w:sz w:val="18"/>
-        </w:rPr>
-        <w:t xml:space="preserve"> </w:t>
-      </w:r>
-      <w:r>
-        <w:rPr>
-          <w:rFonts w:ascii="Consolas" w:hAnsi="Consolas"/>
-          <w:color w:val="1F2937"/>
-          <w:sz w:val="18"/>
-        </w:rPr>
-        <w:t>run</w:t>
-      </w:r>
-    </w:p>
-    <w:p>
-      <w:pPr>
-        <w:pStyle w:val="BodyText"/>
-        <w:keepNext w:val="0"/>
-        <w:spacing w:before="39" w:after="40"/>
-        <w:ind w:left="290" w:firstLine="0"/>
-      </w:pPr>
-      <w:r>
-        <w:rPr>
-          <w:b w:val="0"/>
-        </w:rPr>
-      </w:r>
-      <w:r>
-        <w:rPr>
-          <w:rFonts w:ascii="Consolas" w:hAnsi="Consolas"/>
-          <w:color w:val="1F2937"/>
-          <w:sz w:val="18"/>
-        </w:rPr>
-        <w:t>run</w:t>
-      </w:r>
-      <w:r>
-        <w:rPr>
-          <w:rFonts w:ascii="Consolas" w:hAnsi="Consolas"/>
-          <w:color w:val="1F2937"/>
-          <w:sz w:val="18"/>
-        </w:rPr>
-        <w:t>(</w:t>
-      </w:r>
-      <w:r>
-        <w:rPr>
-          <w:rFonts w:ascii="Consolas" w:hAnsi="Consolas"/>
-          <w:color w:val="1F2937"/>
-          <w:sz w:val="18"/>
-        </w:rPr>
-        <w:t>)</w:t>
-      </w:r>
-    </w:p>
-    <w:p>
-      <w:pPr>
-        <w:pStyle w:val="BodyText"/>
-        <w:keepNext w:val="0"/>
-        <w:spacing w:before="39" w:after="40"/>
-        <w:ind w:left="290" w:firstLine="0"/>
-      </w:pPr>
-      <w:r>
-        <w:rPr>
-          <w:b w:val="0"/>
-        </w:rPr>
-      </w:r>
-      <w:r>
-        <w:rPr>
-          <w:rFonts w:ascii="Consolas" w:hAnsi="Consolas"/>
-          <w:color w:val="1F2937"/>
-          <w:sz w:val="18"/>
-        </w:rPr>
-        <w:t>comparison</w:t>
-      </w:r>
-      <w:r>
-        <w:rPr>
-          <w:rFonts w:ascii="Consolas" w:hAnsi="Consolas"/>
-          <w:color w:val="1F2937"/>
-          <w:sz w:val="18"/>
-        </w:rPr>
-        <w:t xml:space="preserve"> </w:t>
-      </w:r>
-      <w:r>
-        <w:rPr>
-          <w:rFonts w:ascii="Consolas" w:hAnsi="Consolas"/>
-          <w:color w:val="1F2937"/>
-          <w:sz w:val="18"/>
-        </w:rPr>
-        <w:t>=</w:t>
-      </w:r>
-      <w:r>
-        <w:rPr>
-          <w:rFonts w:ascii="Consolas" w:hAnsi="Consolas"/>
-          <w:color w:val="1F2937"/>
-          <w:sz w:val="18"/>
-        </w:rPr>
-        <w:t xml:space="preserve"> </w:t>
-      </w:r>
-      <w:r>
-        <w:rPr>
-          <w:rFonts w:ascii="Consolas" w:hAnsi="Consolas"/>
-          <w:color w:val="1F2937"/>
-          <w:sz w:val="18"/>
-        </w:rPr>
-        <w:t>pd</w:t>
-      </w:r>
-      <w:r>
-        <w:rPr>
-          <w:rFonts w:ascii="Consolas" w:hAnsi="Consolas"/>
-          <w:color w:val="1F2937"/>
-          <w:sz w:val="18"/>
-        </w:rPr>
-        <w:t>.</w:t>
-      </w:r>
-      <w:r>
-        <w:rPr>
-          <w:rFonts w:ascii="Consolas" w:hAnsi="Consolas"/>
-          <w:color w:val="1F2937"/>
-          <w:sz w:val="18"/>
-        </w:rPr>
-        <w:t>read_csv</w:t>
-      </w:r>
-      <w:r>
-        <w:rPr>
-          <w:rFonts w:ascii="Consolas" w:hAnsi="Consolas"/>
-          <w:color w:val="1F2937"/>
-          <w:sz w:val="18"/>
-        </w:rPr>
-        <w:t>(</w:t>
-      </w:r>
-      <w:r>
-        <w:rPr>
-          <w:rFonts w:ascii="Consolas" w:hAnsi="Consolas"/>
-          <w:color w:val="18743B"/>
-          <w:sz w:val="18"/>
-        </w:rPr>
-        <w:t>"</w:t>
-      </w:r>
-      <w:r>
-        <w:rPr>
-          <w:rFonts w:ascii="Consolas" w:hAnsi="Consolas"/>
-          <w:color w:val="18743B"/>
-          <w:sz w:val="18"/>
-        </w:rPr>
-        <w:t>results/metrics.csv</w:t>
-      </w:r>
-      <w:r>
-        <w:rPr>
-          <w:rFonts w:ascii="Consolas" w:hAnsi="Consolas"/>
-          <w:color w:val="18743B"/>
-          <w:sz w:val="18"/>
-        </w:rPr>
-        <w:t>"</w:t>
-      </w:r>
-      <w:r>
-        <w:rPr>
-          <w:rFonts w:ascii="Consolas" w:hAnsi="Consolas"/>
-          <w:color w:val="1F2937"/>
-          <w:sz w:val="18"/>
-        </w:rPr>
-        <w:t>)</w:t>
-      </w:r>
-    </w:p>
-    <w:p>
-      <w:pPr>
-        <w:pStyle w:val="BodyText"/>
-        <w:keepNext w:val="0"/>
-        <w:spacing w:before="39" w:after="40"/>
-        <w:ind w:left="290" w:firstLine="0"/>
-      </w:pPr>
-      <w:r>
-        <w:rPr>
-          <w:b w:val="0"/>
-        </w:rPr>
-      </w:r>
-      <w:r>
-        <w:rPr>
-          <w:rFonts w:ascii="Consolas" w:hAnsi="Consolas"/>
-          <w:color w:val="1F2937"/>
-          <w:sz w:val="18"/>
-        </w:rPr>
-        <w:t>display</w:t>
-      </w:r>
-      <w:r>
-        <w:rPr>
-          <w:rFonts w:ascii="Consolas" w:hAnsi="Consolas"/>
-          <w:color w:val="1F2937"/>
-          <w:sz w:val="18"/>
-        </w:rPr>
-        <w:t>(</w:t>
-      </w:r>
-      <w:r>
-        <w:rPr>
-          <w:rFonts w:ascii="Consolas" w:hAnsi="Consolas"/>
-          <w:color w:val="1F2937"/>
-          <w:sz w:val="18"/>
-        </w:rPr>
-        <w:t>comparison</w:t>
-      </w:r>
-      <w:r>
-        <w:rPr>
-          <w:rFonts w:ascii="Consolas" w:hAnsi="Consolas"/>
-          <w:color w:val="1F2937"/>
-          <w:sz w:val="18"/>
-        </w:rPr>
-        <w:t>.</w:t>
-      </w:r>
-      <w:r>
-        <w:rPr>
-          <w:rFonts w:ascii="Consolas" w:hAnsi="Consolas"/>
-          <w:color w:val="1F2937"/>
-          <w:sz w:val="18"/>
-        </w:rPr>
-        <w:t>round</w:t>
-      </w:r>
-      <w:r>
-        <w:rPr>
-          <w:rFonts w:ascii="Consolas" w:hAnsi="Consolas"/>
-          <w:color w:val="1F2937"/>
-          <w:sz w:val="18"/>
-        </w:rPr>
-        <w:t>(</w:t>
-      </w:r>
-      <w:r>
-        <w:rPr>
-          <w:rFonts w:ascii="Consolas" w:hAnsi="Consolas"/>
-          <w:color w:val="B45309"/>
-          <w:sz w:val="18"/>
-        </w:rPr>
-        <w:t>2</w:t>
-      </w:r>
-      <w:r>
-        <w:rPr>
-          <w:rFonts w:ascii="Consolas" w:hAnsi="Consolas"/>
-          <w:color w:val="1F2937"/>
-          <w:sz w:val="18"/>
-        </w:rPr>
-        <w:t>)</w:t>
-      </w:r>
-      <w:r>
-        <w:rPr>
-          <w:rFonts w:ascii="Consolas" w:hAnsi="Consolas"/>
-          <w:color w:val="1F2937"/>
-          <w:sz w:val="18"/>
-        </w:rPr>
-        <w:t>)</w:t>
-      </w:r>
-    </w:p>
-    <w:p>
-      <w:pPr>
-        <w:pStyle w:val="BodyText"/>
-        <w:keepNext w:val="0"/>
-        <w:spacing w:before="39" w:after="40"/>
-        <w:ind w:left="290" w:firstLine="0"/>
-      </w:pPr>
-      <w:r>
-        <w:rPr>
-          <w:b w:val="0"/>
-        </w:rPr>
-      </w:r>
-      <w:r>
-        <w:rPr>
-          <w:rFonts w:ascii="Consolas" w:hAnsi="Consolas"/>
-          <w:color w:val="1F2937"/>
-          <w:sz w:val="18"/>
-        </w:rPr>
-        <w:t>alerts</w:t>
-      </w:r>
-      <w:r>
-        <w:rPr>
-          <w:rFonts w:ascii="Consolas" w:hAnsi="Consolas"/>
-          <w:color w:val="1F2937"/>
-          <w:sz w:val="18"/>
-        </w:rPr>
-        <w:t xml:space="preserve"> </w:t>
-      </w:r>
-      <w:r>
-        <w:rPr>
-          <w:rFonts w:ascii="Consolas" w:hAnsi="Consolas"/>
-          <w:color w:val="1F2937"/>
-          <w:sz w:val="18"/>
-        </w:rPr>
-        <w:t>=</w:t>
-      </w:r>
-      <w:r>
-        <w:rPr>
-          <w:rFonts w:ascii="Consolas" w:hAnsi="Consolas"/>
-          <w:color w:val="1F2937"/>
-          <w:sz w:val="18"/>
-        </w:rPr>
-        <w:t xml:space="preserve"> </w:t>
-      </w:r>
-      <w:r>
-        <w:rPr>
-          <w:rFonts w:ascii="Consolas" w:hAnsi="Consolas"/>
-          <w:color w:val="1F2937"/>
-          <w:sz w:val="18"/>
-        </w:rPr>
-        <w:t>pd</w:t>
-      </w:r>
-      <w:r>
-        <w:rPr>
-          <w:rFonts w:ascii="Consolas" w:hAnsi="Consolas"/>
-          <w:color w:val="1F2937"/>
-          <w:sz w:val="18"/>
-        </w:rPr>
-        <w:t>.</w:t>
-      </w:r>
-      <w:r>
-        <w:rPr>
-          <w:rFonts w:ascii="Consolas" w:hAnsi="Consolas"/>
-          <w:color w:val="1F2937"/>
-          <w:sz w:val="18"/>
-        </w:rPr>
-        <w:t>read_csv</w:t>
-      </w:r>
-      <w:r>
-        <w:rPr>
-          <w:rFonts w:ascii="Consolas" w:hAnsi="Consolas"/>
-          <w:color w:val="1F2937"/>
-          <w:sz w:val="18"/>
-        </w:rPr>
-        <w:t>(</w:t>
-      </w:r>
-      <w:r>
-        <w:rPr>
-          <w:rFonts w:ascii="Consolas" w:hAnsi="Consolas"/>
-          <w:color w:val="18743B"/>
-          <w:sz w:val="18"/>
-        </w:rPr>
-        <w:t>"</w:t>
-      </w:r>
-      <w:r>
-        <w:rPr>
-          <w:rFonts w:ascii="Consolas" w:hAnsi="Consolas"/>
-          <w:color w:val="18743B"/>
-          <w:sz w:val="18"/>
-        </w:rPr>
-        <w:t>results/anomalies.csv</w:t>
-      </w:r>
-      <w:r>
-        <w:rPr>
-          <w:rFonts w:ascii="Consolas" w:hAnsi="Consolas"/>
-          <w:color w:val="18743B"/>
-          <w:sz w:val="18"/>
-        </w:rPr>
-        <w:t>"</w:t>
-      </w:r>
-      <w:r>
-        <w:rPr>
-          <w:rFonts w:ascii="Consolas" w:hAnsi="Consolas"/>
-          <w:color w:val="1F2937"/>
-          <w:sz w:val="18"/>
-        </w:rPr>
-        <w:t>)</w:t>
-      </w:r>
-    </w:p>
-    <w:p>
-      <w:pPr>
-        <w:pStyle w:val="BodyText"/>
-        <w:keepNext w:val="0"/>
-        <w:spacing w:before="39" w:after="40"/>
-        <w:ind w:left="290" w:firstLine="0"/>
-      </w:pPr>
-      <w:r>
-        <w:rPr>
-          <w:b w:val="0"/>
-        </w:rPr>
-      </w:r>
-      <w:r>
-        <w:rPr>
-          <w:rFonts w:ascii="Consolas" w:hAnsi="Consolas"/>
-          <w:color w:val="1F2937"/>
-          <w:sz w:val="18"/>
-        </w:rPr>
-        <w:t>display</w:t>
-      </w:r>
-      <w:r>
-        <w:rPr>
-          <w:rFonts w:ascii="Consolas" w:hAnsi="Consolas"/>
-          <w:color w:val="1F2937"/>
-          <w:sz w:val="18"/>
-        </w:rPr>
-        <w:t>(</w:t>
-      </w:r>
-      <w:r>
-        <w:rPr>
-          <w:rFonts w:ascii="Consolas" w:hAnsi="Consolas"/>
-          <w:color w:val="1F2937"/>
-          <w:sz w:val="18"/>
-        </w:rPr>
-        <w:t>alerts</w:t>
-      </w:r>
-      <w:r>
-        <w:rPr>
-          <w:rFonts w:ascii="Consolas" w:hAnsi="Consolas"/>
-          <w:color w:val="1F2937"/>
-          <w:sz w:val="18"/>
-        </w:rPr>
-        <w:t>.</w:t>
-      </w:r>
-      <w:r>
-        <w:rPr>
-          <w:rFonts w:ascii="Consolas" w:hAnsi="Consolas"/>
-          <w:color w:val="1F2937"/>
-          <w:sz w:val="18"/>
-        </w:rPr>
-        <w:t>loc</w:t>
-      </w:r>
-      <w:r>
-        <w:rPr>
-          <w:rFonts w:ascii="Consolas" w:hAnsi="Consolas"/>
-          <w:color w:val="1F2937"/>
-          <w:sz w:val="18"/>
-        </w:rPr>
-        <w:t>[</w:t>
-      </w:r>
-      <w:r>
-        <w:rPr>
-          <w:rFonts w:ascii="Consolas" w:hAnsi="Consolas"/>
-          <w:color w:val="1F2937"/>
-          <w:sz w:val="18"/>
-        </w:rPr>
-        <w:t>alerts</w:t>
-      </w:r>
-      <w:r>
-        <w:rPr>
-          <w:rFonts w:ascii="Consolas" w:hAnsi="Consolas"/>
-          <w:color w:val="1F2937"/>
-          <w:sz w:val="18"/>
-        </w:rPr>
-        <w:t>[</w:t>
-      </w:r>
-      <w:r>
-        <w:rPr>
-          <w:rFonts w:ascii="Consolas" w:hAnsi="Consolas"/>
-          <w:color w:val="18743B"/>
-          <w:sz w:val="18"/>
-        </w:rPr>
-        <w:t>"</w:t>
-      </w:r>
-      <w:r>
-        <w:rPr>
-          <w:rFonts w:ascii="Consolas" w:hAnsi="Consolas"/>
-          <w:color w:val="18743B"/>
-          <w:sz w:val="18"/>
-        </w:rPr>
-        <w:t>flag</w:t>
-      </w:r>
-      <w:r>
-        <w:rPr>
-          <w:rFonts w:ascii="Consolas" w:hAnsi="Consolas"/>
-          <w:color w:val="18743B"/>
-          <w:sz w:val="18"/>
-        </w:rPr>
-        <w:t>"</w:t>
-      </w:r>
-      <w:r>
-        <w:rPr>
-          <w:rFonts w:ascii="Consolas" w:hAnsi="Consolas"/>
-          <w:color w:val="1F2937"/>
-          <w:sz w:val="18"/>
-        </w:rPr>
-        <w:t>]</w:t>
-      </w:r>
-      <w:r>
-        <w:rPr>
-          <w:rFonts w:ascii="Consolas" w:hAnsi="Consolas"/>
-          <w:color w:val="1F2937"/>
-          <w:sz w:val="18"/>
-        </w:rPr>
-        <w:t>]</w:t>
-      </w:r>
-      <w:r>
-        <w:rPr>
-          <w:rFonts w:ascii="Consolas" w:hAnsi="Consolas"/>
-          <w:color w:val="1F2937"/>
-          <w:sz w:val="18"/>
-        </w:rPr>
-        <w:t>)</w:t>
-      </w:r>
-    </w:p>
-    <w:p>
-      <w:pPr>
-        <w:pStyle w:val="BodyText"/>
         <w:keepNext/>
         <w:spacing w:before="39" w:after="120"/>
         <w:ind w:left="290" w:firstLine="0"/>
@@ -9397,7 +8847,7 @@
       <w:r>
         <w:drawing>
           <wp:inline>
-            <wp:extent cx="6217920" cy="2710725"/>
+            <wp:extent cx="6217920" cy="3498491"/>
             <wp:docPr id="17" name="Picture 17"/>
             <wp:cNvGraphicFramePr>
               <a:graphicFrameLocks noChangeAspect="1"/>
@@ -9406,7 +8856,7 @@
               <a:graphicData uri="http://schemas.openxmlformats.org/drawingml/2006/picture">
                 <pic:pic>
                   <pic:nvPicPr>
-                    <pic:cNvPr id="0" name="notebook_output.png"/>
+                    <pic:cNvPr id="0" name="colab_analysis_cell_uhd.jpg"/>
                     <pic:cNvPicPr/>
                   </pic:nvPicPr>
                   <pic:blipFill>
@@ -9418,7 +8868,7 @@
                   <pic:spPr>
                     <a:xfrm>
                       <a:off x="0" y="0"/>
-                      <a:ext cx="6217920" cy="2710725"/>
+                      <a:ext cx="6217920" cy="3498491"/>
                     </a:xfrm>
                     <a:prstGeom prst="rect"/>
                   </pic:spPr>
@@ -9441,7 +8891,85 @@
         <w:rPr>
           <w:b w:val="0"/>
         </w:rPr>
-        <w:t>Figure 7  Executed notebook output showing forecast errors and anomaly alerts</w:t>
+        <w:t>Figure 7  Real Google Colab capture of the complete analysis cell and saved output</w:t>
+      </w:r>
+    </w:p>
+    <w:p>
+      <w:pPr>
+        <w:pStyle w:val="BodyText"/>
+        <w:keepNext w:val="0"/>
+        <w:pageBreakBefore/>
+        <w:spacing w:before="39" w:after="120"/>
+        <w:ind w:left="290" w:firstLine="0"/>
+      </w:pPr>
+      <w:r>
+        <w:rPr>
+          <w:b/>
+        </w:rPr>
+        <w:t>Notebook verification code and output</w:t>
+      </w:r>
+    </w:p>
+    <w:p>
+      <w:pPr>
+        <w:pStyle w:val="BodyText"/>
+        <w:keepNext/>
+        <w:spacing w:before="39" w:after="120"/>
+        <w:ind w:left="290" w:firstLine="0"/>
+        <w:jc w:val="center"/>
+      </w:pPr>
+      <w:r>
+        <w:rPr>
+          <w:b w:val="0"/>
+        </w:rPr>
+      </w:r>
+      <w:r>
+        <w:drawing>
+          <wp:inline>
+            <wp:extent cx="6217920" cy="1390165"/>
+            <wp:docPr id="18" name="Picture 18"/>
+            <wp:cNvGraphicFramePr>
+              <a:graphicFrameLocks noChangeAspect="1"/>
+            </wp:cNvGraphicFramePr>
+            <a:graphic>
+              <a:graphicData uri="http://schemas.openxmlformats.org/drawingml/2006/picture">
+                <pic:pic>
+                  <pic:nvPicPr>
+                    <pic:cNvPr id="0" name="colab_tests_cell_uhd.jpg"/>
+                    <pic:cNvPicPr/>
+                  </pic:nvPicPr>
+                  <pic:blipFill>
+                    <a:blip r:embed="rId20"/>
+                    <a:stretch>
+                      <a:fillRect/>
+                    </a:stretch>
+                  </pic:blipFill>
+                  <pic:spPr>
+                    <a:xfrm>
+                      <a:off x="0" y="0"/>
+                      <a:ext cx="6217920" cy="1390165"/>
+                    </a:xfrm>
+                    <a:prstGeom prst="rect"/>
+                  </pic:spPr>
+                </pic:pic>
+              </a:graphicData>
+            </a:graphic>
+          </wp:inline>
+        </w:drawing>
+      </w:r>
+    </w:p>
+    <w:p>
+      <w:pPr>
+        <w:pStyle w:val="BodyText"/>
+        <w:keepNext w:val="0"/>
+        <w:spacing w:before="39" w:after="120"/>
+        <w:ind w:left="290" w:firstLine="0"/>
+        <w:jc w:val="center"/>
+      </w:pPr>
+      <w:r>
+        <w:rPr>
+          <w:b w:val="0"/>
+        </w:rPr>
+        <w:t>Figure 8  Real Google Colab capture of verification code and all test outputs</w:t>
       </w:r>
     </w:p>
     <w:p>

</xml_diff>

<commit_message>
Add forecasting theory and compact report from fifteen to ten pages
</commit_message>
<xml_diff>
--- a/docs/CEP_Report.docx
+++ b/docs/CEP_Report.docx
@@ -4,7 +4,9 @@
   <w:body>
     <w:p>
       <w:pPr>
-        <w:spacing w:before="72"/>
+        <w:pageBreakBefore w:val="0"/>
+        <w:widowControl/>
+        <w:spacing w:before="40" w:after="80"/>
         <w:ind w:left="2726" w:right="2361" w:hanging="2"/>
         <w:jc w:val="center"/>
         <w:rPr>
@@ -59,7 +61,10 @@
     </w:p>
     <w:p>
       <w:pPr>
-        <w:spacing w:before="72"/>
+        <w:keepNext/>
+        <w:pageBreakBefore w:val="0"/>
+        <w:widowControl/>
+        <w:spacing w:before="40" w:after="80"/>
         <w:ind w:left="2726" w:right="2361" w:hanging="2"/>
         <w:jc w:val="center"/>
         <w:rPr>
@@ -123,6 +128,10 @@
     <w:p>
       <w:pPr>
         <w:pStyle w:val="Heading1"/>
+        <w:keepNext/>
+        <w:pageBreakBefore w:val="0"/>
+        <w:widowControl/>
+        <w:spacing w:before="40" w:after="80"/>
       </w:pPr>
       <w:r>
         <w:t>DATA ANALYTICS AND VISUALIZATION DAV PROJECT REPORT</w:t>
@@ -166,7 +175,10 @@
     <w:p>
       <w:pPr>
         <w:pStyle w:val="Heading2"/>
-        <w:spacing w:before="80"/>
+        <w:keepNext/>
+        <w:pageBreakBefore w:val="0"/>
+        <w:widowControl/>
+        <w:spacing w:before="40" w:after="80"/>
         <w:ind w:left="290" w:firstLine="0"/>
       </w:pPr>
       <w:bookmarkStart w:name="Group_and_Project_Details" w:id="0"/>
@@ -221,13 +233,15 @@
     <w:p>
       <w:pPr>
         <w:pStyle w:val="BodyText"/>
+        <w:pageBreakBefore w:val="0"/>
+        <w:widowControl/>
         <w:tabs>
           <w:tab w:val="left" w:pos="2193"/>
           <w:tab w:val="left" w:pos="5264"/>
           <w:tab w:val="left" w:pos="7644"/>
           <w:tab w:val="left" w:pos="7794"/>
         </w:tabs>
-        <w:spacing w:before="40" w:line="285" w:lineRule="auto"/>
+        <w:spacing w:before="40" w:line="285" w:lineRule="auto" w:after="80"/>
         <w:ind w:left="290" w:right="2643" w:firstLine="0"/>
       </w:pPr>
       <w:r>
@@ -290,12 +304,14 @@
     <w:p>
       <w:pPr>
         <w:pStyle w:val="BodyText"/>
+        <w:pageBreakBefore w:val="0"/>
+        <w:widowControl/>
         <w:tabs>
           <w:tab w:val="left" w:pos="2992"/>
           <w:tab w:val="left" w:pos="5746"/>
           <w:tab w:val="left" w:pos="8501"/>
         </w:tabs>
-        <w:spacing w:line="216" w:lineRule="exact"/>
+        <w:spacing w:line="216" w:lineRule="exact" w:before="40" w:after="80"/>
         <w:ind w:left="290" w:firstLine="0"/>
       </w:pPr>
       <w:r>
@@ -322,12 +338,14 @@
     <w:p>
       <w:pPr>
         <w:pStyle w:val="BodyText"/>
+        <w:pageBreakBefore w:val="0"/>
+        <w:widowControl/>
         <w:tabs>
           <w:tab w:val="left" w:pos="2992"/>
           <w:tab w:val="left" w:pos="5746"/>
           <w:tab w:val="left" w:pos="8501"/>
         </w:tabs>
-        <w:spacing w:before="40"/>
+        <w:spacing w:before="40" w:after="80"/>
         <w:ind w:left="290" w:firstLine="0"/>
       </w:pPr>
       <w:r>
@@ -354,12 +372,14 @@
     <w:p>
       <w:pPr>
         <w:pStyle w:val="BodyText"/>
+        <w:pageBreakBefore w:val="0"/>
+        <w:widowControl/>
         <w:tabs>
           <w:tab w:val="left" w:pos="2992"/>
           <w:tab w:val="left" w:pos="5746"/>
           <w:tab w:val="left" w:pos="8501"/>
         </w:tabs>
-        <w:spacing w:before="41"/>
+        <w:spacing w:before="40" w:after="80"/>
         <w:ind w:left="290" w:firstLine="0"/>
       </w:pPr>
       <w:r>
@@ -388,7 +408,9 @@
       <w:pPr>
         <w:pStyle w:val="BodyText"/>
         <w:keepNext w:val="0"/>
-        <w:spacing w:before="39" w:after="120"/>
+        <w:pageBreakBefore w:val="0"/>
+        <w:widowControl/>
+        <w:spacing w:before="40" w:after="80"/>
         <w:ind w:left="290" w:firstLine="0"/>
       </w:pPr>
       <w:r>
@@ -402,7 +424,9 @@
       <w:pPr>
         <w:pStyle w:val="BodyText"/>
         <w:keepNext w:val="0"/>
-        <w:spacing w:before="39" w:after="120"/>
+        <w:pageBreakBefore w:val="0"/>
+        <w:widowControl/>
+        <w:spacing w:before="40" w:after="80"/>
         <w:ind w:left="290" w:firstLine="0"/>
       </w:pPr>
       <w:r>
@@ -415,7 +439,9 @@
     <w:p>
       <w:pPr>
         <w:pStyle w:val="BodyText"/>
-        <w:spacing w:before="1"/>
+        <w:pageBreakBefore w:val="0"/>
+        <w:widowControl/>
+        <w:spacing w:before="40" w:after="80"/>
         <w:ind w:left="0" w:firstLine="0"/>
         <w:rPr>
           <w:sz w:val="15"/>
@@ -498,6 +524,9 @@
     <w:p>
       <w:pPr>
         <w:pStyle w:val="Heading2"/>
+        <w:keepNext/>
+        <w:pageBreakBefore w:val="0"/>
+        <w:widowControl/>
         <w:numPr>
           <w:ilvl w:val="0"/>
           <w:numId w:val="1"/>
@@ -505,7 +534,7 @@
         <w:tabs>
           <w:tab w:val="left" w:pos="508"/>
         </w:tabs>
-        <w:spacing w:before="98"/>
+        <w:spacing w:before="40" w:after="80"/>
         <w:ind w:left="508" w:hanging="218"/>
       </w:pPr>
       <w:bookmarkStart w:name="1._Abstract" w:id="1"/>
@@ -522,7 +551,9 @@
       <w:pPr>
         <w:pStyle w:val="BodyText"/>
         <w:keepNext w:val="0"/>
-        <w:spacing w:before="39"/>
+        <w:pageBreakBefore w:val="0"/>
+        <w:widowControl/>
+        <w:spacing w:before="40" w:after="80"/>
         <w:ind w:left="290" w:firstLine="0"/>
       </w:pPr>
       <w:r>
@@ -622,6 +653,9 @@
     <w:p>
       <w:pPr>
         <w:pStyle w:val="Heading2"/>
+        <w:keepNext/>
+        <w:pageBreakBefore w:val="0"/>
+        <w:widowControl/>
         <w:numPr>
           <w:ilvl w:val="0"/>
           <w:numId w:val="1"/>
@@ -629,6 +663,7 @@
         <w:tabs>
           <w:tab w:val="left" w:pos="508"/>
         </w:tabs>
+        <w:spacing w:before="40" w:after="80"/>
         <w:ind w:left="508" w:hanging="218"/>
       </w:pPr>
       <w:bookmarkStart w:name="2._Introduction_and_Problem_Statement" w:id="2"/>
@@ -684,10 +719,12 @@
       <w:pPr>
         <w:pStyle w:val="BodyText"/>
         <w:keepNext w:val="0"/>
+        <w:pageBreakBefore w:val="0"/>
+        <w:widowControl/>
         <w:tabs>
           <w:tab w:val="left" w:pos="577"/>
         </w:tabs>
-        <w:spacing w:before="39" w:line="219" w:lineRule="exact"/>
+        <w:spacing w:before="40" w:line="219" w:lineRule="exact" w:after="80"/>
         <w:ind w:left="577" w:hanging="172"/>
         <w:rPr>
           <w:sz w:val="19"/>
@@ -815,9 +852,12 @@
       <w:pPr>
         <w:pStyle w:val="BodyText"/>
         <w:keepNext w:val="0"/>
+        <w:pageBreakBefore w:val="0"/>
+        <w:widowControl/>
         <w:tabs>
           <w:tab w:val="left" w:pos="577"/>
         </w:tabs>
+        <w:spacing w:before="40" w:after="80"/>
         <w:ind w:left="577" w:hanging="172"/>
         <w:rPr>
           <w:sz w:val="19"/>
@@ -933,7 +973,9 @@
     <w:p>
       <w:pPr>
         <w:pStyle w:val="Heading2"/>
-        <w:pageBreakBefore/>
+        <w:keepNext/>
+        <w:pageBreakBefore w:val="0"/>
+        <w:widowControl/>
         <w:numPr>
           <w:ilvl w:val="0"/>
           <w:numId w:val="1"/>
@@ -941,7 +983,7 @@
         <w:tabs>
           <w:tab w:val="left" w:pos="508"/>
         </w:tabs>
-        <w:spacing w:before="81"/>
+        <w:spacing w:before="40" w:after="80"/>
         <w:ind w:left="508" w:hanging="218"/>
       </w:pPr>
       <w:bookmarkStart w:name="3._Existing_System_/_Literature_Review" w:id="3"/>
@@ -1010,10 +1052,12 @@
       <w:pPr>
         <w:pStyle w:val="BodyText"/>
         <w:keepNext w:val="0"/>
+        <w:pageBreakBefore w:val="0"/>
+        <w:widowControl/>
         <w:tabs>
           <w:tab w:val="left" w:pos="578"/>
         </w:tabs>
-        <w:spacing w:before="39"/>
+        <w:spacing w:before="40" w:after="80"/>
         <w:ind w:right="489"/>
         <w:rPr>
           <w:sz w:val="19"/>
@@ -1215,7 +1259,98 @@
     </w:p>
     <w:p>
       <w:pPr>
+        <w:pStyle w:val="BodyText"/>
+        <w:keepNext/>
+        <w:pageBreakBefore w:val="0"/>
+        <w:widowControl/>
+        <w:tabs>
+          <w:tab w:val="left" w:pos="2193"/>
+          <w:tab w:val="left" w:pos="5264"/>
+          <w:tab w:val="left" w:pos="7644"/>
+          <w:tab w:val="left" w:pos="7794"/>
+        </w:tabs>
+        <w:spacing w:before="40" w:line="285" w:lineRule="auto" w:after="80"/>
+        <w:ind w:left="290" w:right="2643" w:firstLine="0"/>
+      </w:pPr>
+      <w:r>
+        <w:rPr>
+          <w:b/>
+        </w:rPr>
+        <w:t>Forecasting theory</w:t>
+      </w:r>
+    </w:p>
+    <w:p>
+      <w:pPr>
+        <w:pStyle w:val="BodyText"/>
+        <w:keepNext w:val="0"/>
+        <w:pageBreakBefore w:val="0"/>
+        <w:widowControl/>
+        <w:tabs>
+          <w:tab w:val="left" w:pos="2193"/>
+          <w:tab w:val="left" w:pos="5264"/>
+          <w:tab w:val="left" w:pos="7644"/>
+          <w:tab w:val="left" w:pos="7794"/>
+        </w:tabs>
+        <w:spacing w:before="40" w:line="285" w:lineRule="auto" w:after="80"/>
+        <w:ind w:left="290" w:right="2643" w:firstLine="0"/>
+      </w:pPr>
+      <w:r>
+        <w:rPr>
+          <w:b w:val="0"/>
+        </w:rPr>
+        <w:t>A monthly demand series can be interpreted as a combination of trend, seasonal variation and irregular changes. Trend describes persistent movement in the level, while seasonality repeats at a calendar frequency. Monthly water demand commonly has a twelve-month cycle. An additive decomposition expresses demand as level/trend plus a seasonal component and a residual. STL separates these components using local smoothing; its robust option reduces the influence of isolated extremes during decomposition without deleting the original observations.</w:t>
+      </w:r>
+    </w:p>
+    <w:p>
+      <w:pPr>
+        <w:pStyle w:val="BodyText"/>
+        <w:keepNext w:val="0"/>
+        <w:pageBreakBefore w:val="0"/>
+        <w:widowControl/>
+        <w:tabs>
+          <w:tab w:val="left" w:pos="2193"/>
+          <w:tab w:val="left" w:pos="5264"/>
+          <w:tab w:val="left" w:pos="7644"/>
+          <w:tab w:val="left" w:pos="7794"/>
+        </w:tabs>
+        <w:spacing w:before="40" w:line="285" w:lineRule="auto" w:after="80"/>
+        <w:ind w:left="290" w:right="2643" w:firstLine="0"/>
+      </w:pPr>
+      <w:r>
+        <w:rPr>
+          <w:b w:val="0"/>
+        </w:rPr>
+        <w:t>ARIMA combines autoregression, differencing and moving-average error terms. The order p counts lagged observations, d counts ordinary differences and q counts lagged innovations. With first differencing, the model describes monthly changes rather than the original demand level. ACF measures correlation with earlier observations; PACF measures the association at a lag after accounting for intervening lags. These plots suggest candidate orders, while AIC balances fitted likelihood against parameter count. A lower AIC is useful for comparing candidates fitted to the same training series, but it does not guarantee better future forecasts.</w:t>
+      </w:r>
+    </w:p>
+    <w:p>
+      <w:pPr>
+        <w:pStyle w:val="BodyText"/>
+        <w:keepNext w:val="0"/>
+        <w:pageBreakBefore w:val="0"/>
+        <w:widowControl/>
+        <w:tabs>
+          <w:tab w:val="left" w:pos="2193"/>
+          <w:tab w:val="left" w:pos="5264"/>
+          <w:tab w:val="left" w:pos="7644"/>
+          <w:tab w:val="left" w:pos="7794"/>
+        </w:tabs>
+        <w:spacing w:before="40" w:line="285" w:lineRule="auto" w:after="80"/>
+        <w:ind w:left="290" w:right="2643" w:firstLine="0"/>
+      </w:pPr>
+      <w:r>
+        <w:rPr>
+          <w:b w:val="0"/>
+        </w:rPr>
+        <w:t>Holt-Winters updates level, trend and seasonal states with exponentially declining weights on older observations. Seasonal naive forecasts repeat the previous annual cycle and provide a practical benchmark. Weather/calendar regression relates demand to temperature, rainfall and calendar features. Because future weather is unknown, this implementation substitutes historical monthly climatology. The comparison therefore measures performance under an available-information forecasting scenario.</w:t>
+      </w:r>
+    </w:p>
+    <w:p>
+      <w:pPr>
         <w:pStyle w:val="Heading2"/>
+        <w:keepNext/>
+        <w:pageBreakBefore w:val="0"/>
+        <w:widowControl/>
         <w:numPr>
           <w:ilvl w:val="0"/>
           <w:numId w:val="1"/>
@@ -1223,6 +1358,7 @@
         <w:tabs>
           <w:tab w:val="left" w:pos="508"/>
         </w:tabs>
+        <w:spacing w:before="40" w:after="80"/>
         <w:ind w:left="508" w:hanging="218"/>
       </w:pPr>
       <w:bookmarkStart w:name="4._Dataset_and_Requirements" w:id="4"/>
@@ -1265,10 +1401,12 @@
       <w:pPr>
         <w:pStyle w:val="BodyText"/>
         <w:keepNext w:val="0"/>
+        <w:pageBreakBefore w:val="0"/>
+        <w:widowControl/>
         <w:tabs>
           <w:tab w:val="left" w:pos="577"/>
         </w:tabs>
-        <w:spacing w:before="39" w:line="219" w:lineRule="exact"/>
+        <w:spacing w:before="40" w:line="219" w:lineRule="exact" w:after="80"/>
         <w:ind w:left="577" w:hanging="172"/>
         <w:rPr>
           <w:sz w:val="19"/>
@@ -1446,7 +1584,7 @@
           </w:tcPr>
           <w:p>
             <w:pPr>
-              <w:keepNext w:val="0"/>
+              <w:keepNext/>
               <w:spacing w:after="40" w:before="40"/>
             </w:pPr>
             <w:r>
@@ -1471,7 +1609,7 @@
           </w:tcPr>
           <w:p>
             <w:pPr>
-              <w:keepNext w:val="0"/>
+              <w:keepNext/>
               <w:spacing w:after="40" w:before="40"/>
             </w:pPr>
             <w:r>
@@ -1501,7 +1639,7 @@
           </w:tcPr>
           <w:p>
             <w:pPr>
-              <w:keepNext w:val="0"/>
+              <w:keepNext/>
               <w:spacing w:after="40" w:before="40"/>
             </w:pPr>
             <w:r>
@@ -1526,7 +1664,7 @@
           </w:tcPr>
           <w:p>
             <w:pPr>
-              <w:keepNext w:val="0"/>
+              <w:keepNext/>
               <w:spacing w:after="40" w:before="40"/>
             </w:pPr>
             <w:r>
@@ -1556,7 +1694,7 @@
           </w:tcPr>
           <w:p>
             <w:pPr>
-              <w:keepNext w:val="0"/>
+              <w:keepNext/>
               <w:spacing w:after="40" w:before="40"/>
             </w:pPr>
             <w:r>
@@ -1581,7 +1719,7 @@
           </w:tcPr>
           <w:p>
             <w:pPr>
-              <w:keepNext w:val="0"/>
+              <w:keepNext/>
               <w:spacing w:after="40" w:before="40"/>
             </w:pPr>
             <w:r>
@@ -1611,7 +1749,7 @@
           </w:tcPr>
           <w:p>
             <w:pPr>
-              <w:keepNext w:val="0"/>
+              <w:keepNext/>
               <w:spacing w:after="40" w:before="40"/>
             </w:pPr>
             <w:r>
@@ -1636,7 +1774,7 @@
           </w:tcPr>
           <w:p>
             <w:pPr>
-              <w:keepNext w:val="0"/>
+              <w:keepNext/>
               <w:spacing w:after="40" w:before="40"/>
             </w:pPr>
             <w:r>
@@ -1666,7 +1804,7 @@
           </w:tcPr>
           <w:p>
             <w:pPr>
-              <w:keepNext w:val="0"/>
+              <w:keepNext/>
               <w:spacing w:after="40" w:before="40"/>
             </w:pPr>
             <w:r>
@@ -1691,7 +1829,7 @@
           </w:tcPr>
           <w:p>
             <w:pPr>
-              <w:keepNext w:val="0"/>
+              <w:keepNext/>
               <w:spacing w:after="40" w:before="40"/>
             </w:pPr>
             <w:r>
@@ -1721,7 +1859,7 @@
           </w:tcPr>
           <w:p>
             <w:pPr>
-              <w:keepNext w:val="0"/>
+              <w:keepNext/>
               <w:spacing w:after="40" w:before="40"/>
             </w:pPr>
             <w:r>
@@ -1746,7 +1884,7 @@
           </w:tcPr>
           <w:p>
             <w:pPr>
-              <w:keepNext w:val="0"/>
+              <w:keepNext/>
               <w:spacing w:after="40" w:before="40"/>
             </w:pPr>
             <w:r>
@@ -1819,17 +1957,12 @@
       <w:pPr>
         <w:pStyle w:val="BodyText"/>
         <w:keepNext w:val="0"/>
-        <w:spacing w:before="39"/>
-        <w:ind w:left="290" w:firstLine="0"/>
-      </w:pPr>
-    </w:p>
-    <w:p>
-      <w:pPr>
-        <w:pStyle w:val="BodyText"/>
-        <w:keepNext w:val="0"/>
+        <w:pageBreakBefore w:val="0"/>
+        <w:widowControl/>
         <w:tabs>
           <w:tab w:val="left" w:pos="577"/>
         </w:tabs>
+        <w:spacing w:before="40" w:after="80"/>
         <w:ind w:left="577" w:hanging="172"/>
         <w:rPr>
           <w:sz w:val="19"/>
@@ -1956,7 +2089,9 @@
     <w:p>
       <w:pPr>
         <w:pStyle w:val="Heading2"/>
-        <w:pageBreakBefore/>
+        <w:keepNext/>
+        <w:pageBreakBefore w:val="0"/>
+        <w:widowControl/>
         <w:numPr>
           <w:ilvl w:val="0"/>
           <w:numId w:val="1"/>
@@ -1964,7 +2099,7 @@
         <w:tabs>
           <w:tab w:val="left" w:pos="508"/>
         </w:tabs>
-        <w:spacing w:before="81"/>
+        <w:spacing w:before="40" w:after="80"/>
         <w:ind w:left="508" w:hanging="218"/>
       </w:pPr>
       <w:bookmarkStart w:name="5._Proposed_Methodology_and_System_Desig" w:id="5"/>
@@ -2033,10 +2168,12 @@
       <w:pPr>
         <w:pStyle w:val="BodyText"/>
         <w:keepNext w:val="0"/>
+        <w:pageBreakBefore w:val="0"/>
+        <w:widowControl/>
         <w:tabs>
           <w:tab w:val="left" w:pos="577"/>
         </w:tabs>
-        <w:spacing w:before="39" w:line="219" w:lineRule="exact"/>
+        <w:spacing w:before="40" w:line="219" w:lineRule="exact" w:after="80"/>
         <w:ind w:left="577" w:hanging="172"/>
         <w:rPr>
           <w:sz w:val="19"/>
@@ -2208,7 +2345,9 @@
       <w:pPr>
         <w:pStyle w:val="BodyText"/>
         <w:keepNext/>
-        <w:spacing w:before="39" w:after="120"/>
+        <w:pageBreakBefore w:val="0"/>
+        <w:widowControl/>
+        <w:spacing w:before="40" w:after="80"/>
         <w:ind w:left="290" w:firstLine="0"/>
         <w:jc w:val="center"/>
       </w:pPr>
@@ -2256,7 +2395,9 @@
       <w:pPr>
         <w:pStyle w:val="BodyText"/>
         <w:keepNext w:val="0"/>
-        <w:spacing w:before="39" w:after="120"/>
+        <w:pageBreakBefore w:val="0"/>
+        <w:widowControl/>
+        <w:spacing w:before="40" w:after="80"/>
         <w:ind w:left="290" w:firstLine="0"/>
         <w:jc w:val="center"/>
       </w:pPr>
@@ -2271,10 +2412,12 @@
       <w:pPr>
         <w:pStyle w:val="BodyText"/>
         <w:keepNext w:val="0"/>
+        <w:pageBreakBefore w:val="0"/>
+        <w:widowControl/>
         <w:tabs>
           <w:tab w:val="left" w:pos="577"/>
         </w:tabs>
-        <w:spacing w:line="219" w:lineRule="exact"/>
+        <w:spacing w:line="219" w:lineRule="exact" w:before="40" w:after="80"/>
         <w:ind w:left="577" w:hanging="172"/>
         <w:rPr>
           <w:sz w:val="19"/>
@@ -2446,9 +2589,12 @@
       <w:pPr>
         <w:pStyle w:val="BodyText"/>
         <w:keepNext w:val="0"/>
+        <w:pageBreakBefore w:val="0"/>
+        <w:widowControl/>
         <w:tabs>
           <w:tab w:val="left" w:pos="577"/>
         </w:tabs>
+        <w:spacing w:before="40" w:after="80"/>
         <w:ind w:left="577" w:hanging="172"/>
         <w:rPr>
           <w:sz w:val="19"/>
@@ -2618,8 +2764,76 @@
     </w:p>
     <w:p>
       <w:pPr>
+        <w:pStyle w:val="BodyText"/>
+        <w:keepNext/>
+        <w:pageBreakBefore w:val="0"/>
+        <w:widowControl/>
+        <w:tabs>
+          <w:tab w:val="left" w:pos="2193"/>
+          <w:tab w:val="left" w:pos="5264"/>
+          <w:tab w:val="left" w:pos="7644"/>
+          <w:tab w:val="left" w:pos="7794"/>
+        </w:tabs>
+        <w:spacing w:before="40" w:line="285" w:lineRule="auto" w:after="80"/>
+        <w:ind w:left="290" w:right="2643" w:firstLine="0"/>
+      </w:pPr>
+      <w:r>
+        <w:rPr>
+          <w:b/>
+        </w:rPr>
+        <w:t>Stationarity and chronological evaluation</w:t>
+      </w:r>
+    </w:p>
+    <w:p>
+      <w:pPr>
+        <w:pStyle w:val="BodyText"/>
+        <w:keepNext w:val="0"/>
+        <w:pageBreakBefore w:val="0"/>
+        <w:widowControl/>
+        <w:tabs>
+          <w:tab w:val="left" w:pos="2193"/>
+          <w:tab w:val="left" w:pos="5264"/>
+          <w:tab w:val="left" w:pos="7644"/>
+          <w:tab w:val="left" w:pos="7794"/>
+        </w:tabs>
+        <w:spacing w:before="40" w:line="285" w:lineRule="auto" w:after="80"/>
+        <w:ind w:left="290" w:right="2643" w:firstLine="0"/>
+      </w:pPr>
+      <w:r>
+        <w:rPr>
+          <w:b w:val="0"/>
+        </w:rPr>
+        <w:t>Weak stationarity requires a constant mean and variance and an autocovariance determined by lag rather than calendar time. Rolling statistics reveal changes in these moments but do not establish stationarity by themselves. The ADF null hypothesis is a unit root; rejection supports evidence against that null under the test specification. Differencing can remove a stochastic trend, although seasonality or changing variance may remain. This is why visual diagnostics, ADF and residual checks are interpreted together.</w:t>
+      </w:r>
+    </w:p>
+    <w:p>
+      <w:pPr>
+        <w:pStyle w:val="BodyText"/>
+        <w:keepNext w:val="0"/>
+        <w:pageBreakBefore w:val="0"/>
+        <w:widowControl/>
+        <w:tabs>
+          <w:tab w:val="left" w:pos="2193"/>
+          <w:tab w:val="left" w:pos="5264"/>
+          <w:tab w:val="left" w:pos="7644"/>
+          <w:tab w:val="left" w:pos="7794"/>
+        </w:tabs>
+        <w:spacing w:before="40" w:line="285" w:lineRule="auto" w:after="80"/>
+        <w:ind w:left="290" w:right="2643" w:firstLine="0"/>
+      </w:pPr>
+      <w:r>
+        <w:rPr>
+          <w:b w:val="0"/>
+        </w:rPr>
+        <w:t>Randomly shuffling a time series can let later observations influence earlier forecasts. A chronological split preserves the direction of information: training estimates parameters, validation chooses the model family and the final test evaluates that fixed choice. A future improvement is rolling-origin evaluation, which repeats this process at multiple forecast dates to examine how accuracy changes across seasons and years.</w:t>
+      </w:r>
+    </w:p>
+    <w:p>
+      <w:pPr>
         <w:pStyle w:val="Heading2"/>
-        <w:pageBreakBefore/>
+        <w:keepNext/>
+        <w:pageBreakBefore w:val="0"/>
+        <w:widowControl/>
         <w:numPr>
           <w:ilvl w:val="0"/>
           <w:numId w:val="1"/>
@@ -2627,7 +2841,7 @@
         <w:tabs>
           <w:tab w:val="left" w:pos="508"/>
         </w:tabs>
-        <w:spacing w:before="81"/>
+        <w:spacing w:before="40" w:after="80"/>
         <w:ind w:left="508" w:hanging="218"/>
       </w:pPr>
       <w:bookmarkStart w:name="6._Algorithm_Design" w:id="6"/>
@@ -2657,10 +2871,12 @@
       <w:pPr>
         <w:pStyle w:val="BodyText"/>
         <w:keepNext w:val="0"/>
+        <w:pageBreakBefore w:val="0"/>
+        <w:widowControl/>
         <w:tabs>
           <w:tab w:val="left" w:pos="577"/>
         </w:tabs>
-        <w:spacing w:before="38"/>
+        <w:spacing w:before="40" w:after="80"/>
         <w:ind w:left="577" w:hanging="172"/>
         <w:rPr>
           <w:sz w:val="19"/>
@@ -2831,189 +3047,283 @@
     <w:p>
       <w:pPr>
         <w:pStyle w:val="BodyText"/>
-        <w:keepNext w:val="0"/>
-        <w:spacing w:before="39" w:after="120"/>
-        <w:ind w:left="290" w:firstLine="0"/>
-      </w:pPr>
-      <w:r>
-        <w:rPr>
-          <w:b w:val="0"/>
-        </w:rPr>
-        <w:t>1  Validate source columns, dates and record keys; remove exact duplicate rows.</w:t>
+        <w:keepNext/>
+        <w:pageBreakBefore w:val="0"/>
+        <w:widowControl/>
+        <w:tabs>
+          <w:tab w:val="left" w:pos="2193"/>
+          <w:tab w:val="left" w:pos="5264"/>
+          <w:tab w:val="left" w:pos="7644"/>
+          <w:tab w:val="left" w:pos="7794"/>
+        </w:tabs>
+        <w:spacing w:before="40" w:line="285" w:lineRule="auto" w:after="80"/>
+        <w:ind w:left="290" w:right="2643" w:firstLine="0"/>
+      </w:pPr>
+      <w:r>
+        <w:rPr>
+          <w:b/>
+        </w:rPr>
+        <w:t>Abnormal demand and allocation principles</w:t>
       </w:r>
     </w:p>
     <w:p>
       <w:pPr>
         <w:pStyle w:val="BodyText"/>
         <w:keepNext w:val="0"/>
-        <w:spacing w:before="39" w:after="120"/>
-        <w:ind w:left="290" w:firstLine="0"/>
+        <w:pageBreakBefore w:val="0"/>
+        <w:widowControl/>
+        <w:tabs>
+          <w:tab w:val="left" w:pos="2193"/>
+          <w:tab w:val="left" w:pos="5264"/>
+          <w:tab w:val="left" w:pos="7644"/>
+          <w:tab w:val="left" w:pos="7794"/>
+        </w:tabs>
+        <w:spacing w:before="40" w:line="285" w:lineRule="auto" w:after="80"/>
+        <w:ind w:left="290" w:right="2643" w:firstLine="0"/>
       </w:pPr>
       <w:r>
         <w:rPr>
           <w:b w:val="0"/>
         </w:rPr>
-        <w:t>2  Map retail classes; exclude utility and wholesale; aggregate monthly sector gallons.</w:t>
+        <w:t>An unusual observation is not automatically a data error. The detector first removes the year-earlier seasonal baseline, then compares the residual with the median and median absolute deviation of earlier residuals. These robust statistics reduce the effect of isolated extremes on the alert threshold. Alerts identify months for investigation; incident records are needed to distinguish leaks, billing adjustments, restrictions and legitimate changes in demand.</w:t>
       </w:r>
     </w:p>
     <w:p>
       <w:pPr>
         <w:pStyle w:val="BodyText"/>
         <w:keepNext w:val="0"/>
-        <w:spacing w:before="39" w:after="120"/>
-        <w:ind w:left="290" w:firstLine="0"/>
+        <w:pageBreakBefore w:val="0"/>
+        <w:widowControl/>
+        <w:tabs>
+          <w:tab w:val="left" w:pos="2193"/>
+          <w:tab w:val="left" w:pos="5264"/>
+          <w:tab w:val="left" w:pos="7644"/>
+          <w:tab w:val="left" w:pos="7794"/>
+        </w:tabs>
+        <w:spacing w:before="40" w:line="285" w:lineRule="auto" w:after="80"/>
+        <w:ind w:left="290" w:right="2643" w:firstLine="0"/>
       </w:pPr>
       <w:r>
         <w:rPr>
           <w:b w:val="0"/>
         </w:rPr>
-        <w:t>3  Join monthly weather and derive calendar features; preserve raw snapshots and hashes.</w:t>
+        <w:t>Allocation is a constrained decision following forecasting. Minimum-service floors protect essential demand, while sector capacity limits represent the maximum water that can be delivered. Priority optimization assigns the remaining water to sectors with higher declared weights; proportional allocation spreads the remaining supply across eligible unmet demand. These are different policy choices. If available supply cannot satisfy the floors, the system must report infeasibility and quantify violations so operators can assess backup supply, restrictions or capacity restoration.</w:t>
       </w:r>
     </w:p>
     <w:p>
       <w:pPr>
         <w:pStyle w:val="BodyText"/>
         <w:keepNext w:val="0"/>
-        <w:spacing w:before="39" w:after="120"/>
+        <w:pageBreakBefore w:val="0"/>
+        <w:widowControl/>
+        <w:spacing w:before="40" w:after="80"/>
         <w:ind w:left="290" w:firstLine="0"/>
       </w:pPr>
       <w:r>
         <w:rPr>
           <w:b w:val="0"/>
         </w:rPr>
-        <w:t>4  Plot sector demand, STL components, rolling mean/variance, ACF and PACF.</w:t>
+        <w:t>1  Validate source columns, dates and record keys; remove exact duplicate rows.</w:t>
       </w:r>
     </w:p>
     <w:p>
       <w:pPr>
         <w:pStyle w:val="BodyText"/>
         <w:keepNext w:val="0"/>
-        <w:spacing w:before="39" w:after="120"/>
+        <w:pageBreakBefore w:val="0"/>
+        <w:widowControl/>
+        <w:spacing w:before="40" w:after="80"/>
         <w:ind w:left="290" w:firstLine="0"/>
       </w:pPr>
       <w:r>
         <w:rPr>
           <w:b w:val="0"/>
         </w:rPr>
-        <w:t>5  Split chronologically; run training ADF; rank converged ARIMA orders by AIC.</w:t>
+        <w:t>2  Map retail classes; exclude utility and wholesale; aggregate monthly sector gallons.</w:t>
       </w:r>
     </w:p>
     <w:p>
       <w:pPr>
         <w:pStyle w:val="BodyText"/>
         <w:keepNext w:val="0"/>
-        <w:spacing w:before="39" w:after="120"/>
+        <w:pageBreakBefore w:val="0"/>
+        <w:widowControl/>
+        <w:spacing w:before="40" w:after="80"/>
         <w:ind w:left="290" w:firstLine="0"/>
       </w:pPr>
       <w:r>
         <w:rPr>
           <w:b w:val="0"/>
         </w:rPr>
-        <w:t>6  Forecast the validation year with each model; select the lowest validation RMSE.</w:t>
+        <w:t>3  Join monthly weather and derive calendar features; preserve raw snapshots and hashes.</w:t>
       </w:r>
     </w:p>
     <w:p>
       <w:pPr>
         <w:pStyle w:val="BodyText"/>
         <w:keepNext w:val="0"/>
-        <w:spacing w:before="39" w:after="120"/>
+        <w:pageBreakBefore w:val="0"/>
+        <w:widowControl/>
+        <w:spacing w:before="40" w:after="80"/>
         <w:ind w:left="290" w:firstLine="0"/>
       </w:pPr>
       <w:r>
         <w:rPr>
           <w:b w:val="0"/>
         </w:rPr>
-        <w:t>7  Refit through 2023; predict untouched 2024; compute MAE, RMSE and MAPE.</w:t>
+        <w:t>4  Plot sector demand, STL components, rolling mean/variance, ACF and PACF.</w:t>
       </w:r>
     </w:p>
     <w:p>
       <w:pPr>
         <w:pStyle w:val="BodyText"/>
         <w:keepNext w:val="0"/>
-        <w:spacing w:before="39" w:after="120"/>
+        <w:pageBreakBefore w:val="0"/>
+        <w:widowControl/>
+        <w:spacing w:before="40" w:after="80"/>
         <w:ind w:left="290" w:firstLine="0"/>
       </w:pPr>
       <w:r>
         <w:rPr>
           <w:b w:val="0"/>
         </w:rPr>
-        <w:t>8  Refit through 2024; forecast 2025; split totals using trailing 12-month sector shares.</w:t>
+        <w:t>5  Split chronologically; run training ADF; rank converged ARIMA orders by AIC.</w:t>
       </w:r>
     </w:p>
     <w:p>
       <w:pPr>
         <w:pStyle w:val="BodyText"/>
         <w:keepNext w:val="0"/>
-        <w:spacing w:before="39" w:after="120"/>
+        <w:pageBreakBefore w:val="0"/>
+        <w:widowControl/>
+        <w:spacing w:before="40" w:after="80"/>
         <w:ind w:left="290" w:firstLine="0"/>
       </w:pPr>
       <w:r>
         <w:rPr>
           <w:b w:val="0"/>
         </w:rPr>
-        <w:t>9  Flag |robust seasonal residual score| &gt; 3.5 using prior residuals only.</w:t>
+        <w:t>6  Forecast the validation year with each model; select the lowest validation RMSE.</w:t>
       </w:r>
     </w:p>
     <w:p>
       <w:pPr>
         <w:pStyle w:val="BodyText"/>
         <w:keepNext w:val="0"/>
-        <w:spacing w:before="39" w:after="120"/>
+        <w:pageBreakBefore w:val="0"/>
+        <w:widowControl/>
+        <w:spacing w:before="40" w:after="80"/>
         <w:ind w:left="290" w:firstLine="0"/>
       </w:pPr>
       <w:r>
         <w:rPr>
           <w:b w:val="0"/>
         </w:rPr>
-        <w:t>10  Check minimum floors against supply and caps; compare priority and proportional allocations.</w:t>
+        <w:t>7  Refit through 2023; predict untouched 2024; compute MAE, RMSE and MAPE.</w:t>
       </w:r>
     </w:p>
     <w:p>
       <w:pPr>
         <w:pStyle w:val="BodyText"/>
         <w:keepNext w:val="0"/>
-        <w:spacing w:before="39" w:after="120"/>
+        <w:pageBreakBefore w:val="0"/>
+        <w:widowControl/>
+        <w:spacing w:before="40" w:after="80"/>
         <w:ind w:left="290" w:firstLine="0"/>
       </w:pPr>
       <w:r>
         <w:rPr>
           <w:b w:val="0"/>
         </w:rPr>
-        <w:t>11  Export metrics, alerts, scenarios and plots; present the interactive dashboard.</w:t>
+        <w:t>8  Refit through 2024; forecast 2025; split totals using trailing 12-month sector shares.</w:t>
       </w:r>
     </w:p>
     <w:p>
       <w:pPr>
         <w:pStyle w:val="BodyText"/>
         <w:keepNext w:val="0"/>
-        <w:spacing w:before="39" w:after="120"/>
+        <w:pageBreakBefore w:val="0"/>
+        <w:widowControl/>
+        <w:spacing w:before="40" w:after="80"/>
         <w:ind w:left="290" w:firstLine="0"/>
       </w:pPr>
       <w:r>
         <w:rPr>
-          <w:b/>
-        </w:rPr>
-        <w:t>Priority allocation objective and constraints</w:t>
+          <w:b w:val="0"/>
+        </w:rPr>
+        <w:t>9  Flag |robust seasonal residual score| &gt; 3.5 using prior residuals only.</w:t>
       </w:r>
     </w:p>
     <w:p>
       <w:pPr>
         <w:pStyle w:val="BodyText"/>
         <w:keepNext w:val="0"/>
-        <w:spacing w:before="39" w:after="120"/>
+        <w:pageBreakBefore w:val="0"/>
+        <w:widowControl/>
+        <w:spacing w:before="40" w:after="80"/>
         <w:ind w:left="290" w:firstLine="0"/>
       </w:pPr>
       <w:r>
         <w:rPr>
           <w:b w:val="0"/>
         </w:rPr>
-        <w:t>Maximize the sum of weighted served demand. For each sector i, minimum_fraction[i] × demand[i] ≤ allocation[i] ≤ min(demand[i], capacity[i]); total allocation ≤ available supply. Minimum fractions are 70%, 35%, 30% and 90%; weights are 4, 2, 1 and 5 for residential, commercial, large volume and municipal respectively. These are declared assumptions. If any floor is infeasible, report emergency service violations rather than a feasible allocation.</w:t>
+        <w:t>10  Check minimum floors against supply and caps; compare priority and proportional allocations.</w:t>
       </w:r>
     </w:p>
     <w:p>
       <w:pPr>
+        <w:pStyle w:val="BodyText"/>
+        <w:keepNext w:val="0"/>
+        <w:pageBreakBefore w:val="0"/>
+        <w:widowControl/>
+        <w:spacing w:before="40" w:after="80"/>
+        <w:ind w:left="290" w:firstLine="0"/>
+      </w:pPr>
+      <w:r>
+        <w:rPr>
+          <w:b w:val="0"/>
+        </w:rPr>
+        <w:t>11  Export metrics, alerts, scenarios and plots; present the interactive dashboard.</w:t>
+      </w:r>
+    </w:p>
+    <w:p>
+      <w:pPr>
+        <w:pStyle w:val="BodyText"/>
+        <w:keepNext/>
+        <w:pageBreakBefore w:val="0"/>
+        <w:widowControl/>
+        <w:spacing w:before="40" w:after="80"/>
+        <w:ind w:left="290" w:firstLine="0"/>
+      </w:pPr>
+      <w:r>
+        <w:rPr>
+          <w:b/>
+        </w:rPr>
+        <w:t>Priority allocation objective and constraints</w:t>
+      </w:r>
+    </w:p>
+    <w:p>
+      <w:pPr>
+        <w:pStyle w:val="BodyText"/>
+        <w:keepNext w:val="0"/>
+        <w:pageBreakBefore w:val="0"/>
+        <w:widowControl/>
+        <w:spacing w:before="40" w:after="80"/>
+        <w:ind w:left="290" w:firstLine="0"/>
+      </w:pPr>
+      <w:r>
+        <w:rPr>
+          <w:b w:val="0"/>
+        </w:rPr>
+        <w:t>Maximize the sum of weighted served demand. For each sector i, minimum_fraction[i] × demand[i] ≤ allocation[i] ≤ min(demand[i], capacity[i]); total allocation ≤ available supply. Minimum fractions are 70%, 35%, 30% and 90%; weights are 4, 2, 1 and 5 for residential, commercial, large volume and municipal respectively. These are declared assumptions. If any floor is infeasible, report emergency service violations rather than a feasible allocation.</w:t>
+      </w:r>
+    </w:p>
+    <w:p>
+      <w:pPr>
         <w:pStyle w:val="Heading2"/>
-        <w:pageBreakBefore/>
+        <w:keepNext/>
+        <w:pageBreakBefore w:val="0"/>
+        <w:widowControl/>
         <w:numPr>
           <w:ilvl w:val="0"/>
           <w:numId w:val="1"/>
@@ -3021,6 +3331,7 @@
         <w:tabs>
           <w:tab w:val="left" w:pos="508"/>
         </w:tabs>
+        <w:spacing w:before="40" w:after="80"/>
         <w:ind w:left="508" w:hanging="218"/>
       </w:pPr>
       <w:bookmarkStart w:name="7._Implementation" w:id="7"/>
@@ -3037,10 +3348,12 @@
       <w:pPr>
         <w:pStyle w:val="BodyText"/>
         <w:keepNext w:val="0"/>
+        <w:pageBreakBefore w:val="0"/>
+        <w:widowControl/>
         <w:tabs>
           <w:tab w:val="left" w:pos="577"/>
         </w:tabs>
-        <w:spacing w:before="39" w:line="219" w:lineRule="exact"/>
+        <w:spacing w:before="40" w:line="219" w:lineRule="exact" w:after="80"/>
         <w:ind w:left="577" w:hanging="172"/>
         <w:rPr>
           <w:sz w:val="19"/>
@@ -3168,9 +3481,12 @@
       <w:pPr>
         <w:pStyle w:val="BodyText"/>
         <w:keepNext w:val="0"/>
+        <w:pageBreakBefore w:val="0"/>
+        <w:widowControl/>
         <w:tabs>
           <w:tab w:val="left" w:pos="577"/>
         </w:tabs>
+        <w:spacing w:before="40" w:after="80"/>
         <w:ind w:left="577" w:hanging="172"/>
         <w:rPr>
           <w:sz w:val="19"/>
@@ -3375,7 +3691,9 @@
       <w:pPr>
         <w:pStyle w:val="BodyText"/>
         <w:keepNext w:val="0"/>
-        <w:spacing w:before="39" w:after="120"/>
+        <w:pageBreakBefore w:val="0"/>
+        <w:widowControl/>
+        <w:spacing w:before="40" w:after="80"/>
         <w:ind w:left="290" w:firstLine="0"/>
       </w:pPr>
       <w:r>
@@ -3391,7 +3709,9 @@
       <w:pPr>
         <w:pStyle w:val="BodyText"/>
         <w:keepNext w:val="0"/>
-        <w:spacing w:before="39" w:after="120"/>
+        <w:pageBreakBefore w:val="0"/>
+        <w:widowControl/>
+        <w:spacing w:before="40" w:after="80"/>
         <w:ind w:left="290" w:firstLine="0"/>
       </w:pPr>
       <w:r>
@@ -3407,7 +3727,9 @@
       <w:pPr>
         <w:pStyle w:val="BodyText"/>
         <w:keepNext w:val="0"/>
-        <w:spacing w:before="39" w:after="120"/>
+        <w:pageBreakBefore w:val="0"/>
+        <w:widowControl/>
+        <w:spacing w:before="40" w:after="80"/>
         <w:ind w:left="290" w:firstLine="0"/>
       </w:pPr>
       <w:r>
@@ -3423,7 +3745,9 @@
       <w:pPr>
         <w:pStyle w:val="BodyText"/>
         <w:keepNext w:val="0"/>
-        <w:spacing w:before="39" w:after="120"/>
+        <w:pageBreakBefore w:val="0"/>
+        <w:widowControl/>
+        <w:spacing w:before="40" w:after="80"/>
         <w:ind w:left="290" w:firstLine="0"/>
       </w:pPr>
       <w:r>
@@ -3439,7 +3763,9 @@
       <w:pPr>
         <w:pStyle w:val="BodyText"/>
         <w:keepNext w:val="0"/>
-        <w:spacing w:before="39" w:after="120"/>
+        <w:pageBreakBefore w:val="0"/>
+        <w:widowControl/>
+        <w:spacing w:before="40" w:after="80"/>
         <w:ind w:left="290" w:firstLine="0"/>
       </w:pPr>
       <w:r>
@@ -3455,7 +3781,9 @@
       <w:pPr>
         <w:pStyle w:val="BodyText"/>
         <w:keepNext w:val="0"/>
-        <w:spacing w:before="39" w:after="120"/>
+        <w:pageBreakBefore w:val="0"/>
+        <w:widowControl/>
+        <w:spacing w:before="40" w:after="80"/>
         <w:ind w:left="290" w:firstLine="0"/>
       </w:pPr>
       <w:r>
@@ -3470,8 +3798,10 @@
     <w:p>
       <w:pPr>
         <w:pStyle w:val="BodyText"/>
-        <w:keepNext w:val="0"/>
-        <w:spacing w:before="39" w:after="120"/>
+        <w:keepNext/>
+        <w:pageBreakBefore w:val="0"/>
+        <w:widowControl/>
+        <w:spacing w:before="40" w:after="80"/>
         <w:ind w:left="290" w:firstLine="0"/>
       </w:pPr>
       <w:r>
@@ -3485,7 +3815,9 @@
       <w:pPr>
         <w:pStyle w:val="BodyText"/>
         <w:keepNext w:val="0"/>
-        <w:spacing w:before="39" w:after="120"/>
+        <w:pageBreakBefore w:val="0"/>
+        <w:widowControl/>
+        <w:spacing w:before="40" w:after="80"/>
         <w:ind w:left="290" w:firstLine="0"/>
       </w:pPr>
       <w:r>
@@ -3498,8 +3830,10 @@
     <w:p>
       <w:pPr>
         <w:pStyle w:val="BodyText"/>
-        <w:keepNext w:val="0"/>
-        <w:spacing w:before="39" w:after="120"/>
+        <w:keepNext/>
+        <w:pageBreakBefore w:val="0"/>
+        <w:widowControl/>
+        <w:spacing w:before="40" w:after="80"/>
         <w:ind w:left="290" w:firstLine="0"/>
       </w:pPr>
       <w:r>
@@ -3513,7 +3847,9 @@
       <w:pPr>
         <w:pStyle w:val="BodyText"/>
         <w:keepNext w:val="0"/>
-        <w:spacing w:before="39" w:after="40"/>
+        <w:pageBreakBefore w:val="0"/>
+        <w:widowControl/>
+        <w:spacing w:before="40" w:after="80"/>
         <w:ind w:left="290" w:firstLine="0"/>
       </w:pPr>
       <w:r>
@@ -3598,7 +3934,9 @@
       <w:pPr>
         <w:pStyle w:val="BodyText"/>
         <w:keepNext w:val="0"/>
-        <w:spacing w:before="39" w:after="40"/>
+        <w:pageBreakBefore w:val="0"/>
+        <w:widowControl/>
+        <w:spacing w:before="40" w:after="80"/>
         <w:ind w:left="290" w:firstLine="0"/>
       </w:pPr>
       <w:r>
@@ -3715,7 +4053,9 @@
       <w:pPr>
         <w:pStyle w:val="BodyText"/>
         <w:keepNext w:val="0"/>
-        <w:spacing w:before="39" w:after="40"/>
+        <w:pageBreakBefore w:val="0"/>
+        <w:widowControl/>
+        <w:spacing w:before="40" w:after="80"/>
         <w:ind w:left="290" w:firstLine="0"/>
       </w:pPr>
       <w:r>
@@ -3952,7 +4292,9 @@
       <w:pPr>
         <w:pStyle w:val="BodyText"/>
         <w:keepNext w:val="0"/>
-        <w:spacing w:before="39" w:after="40"/>
+        <w:pageBreakBefore w:val="0"/>
+        <w:widowControl/>
+        <w:spacing w:before="40" w:after="80"/>
         <w:ind w:left="290" w:firstLine="0"/>
       </w:pPr>
       <w:r>
@@ -4157,7 +4499,9 @@
       <w:pPr>
         <w:pStyle w:val="BodyText"/>
         <w:keepNext w:val="0"/>
-        <w:spacing w:before="39" w:after="40"/>
+        <w:pageBreakBefore w:val="0"/>
+        <w:widowControl/>
+        <w:spacing w:before="40" w:after="80"/>
         <w:ind w:left="290" w:firstLine="0"/>
       </w:pPr>
       <w:r>
@@ -4337,6 +4681,9 @@
     <w:p>
       <w:pPr>
         <w:pStyle w:val="ListParagraph"/>
+        <w:pageBreakBefore w:val="0"/>
+        <w:widowControl/>
+        <w:spacing w:before="40" w:after="80"/>
         <w:rPr>
           <w:sz w:val="19"/>
         </w:rPr>
@@ -4345,7 +4692,7 @@
           <w:footerReference w:type="default" r:id="rId10"/>
           <w:type w:val="continuous"/>
           <w:pgSz w:w="12240" w:h="15840" w:orient="portrait"/>
-          <w:pgMar w:top="720" w:right="1080" w:bottom="880" w:left="720" w:header="0" w:footer="657" w:gutter="0"/>
+          <w:pgMar w:top="720" w:right="1080" w:bottom="1300" w:left="720" w:header="0" w:footer="657" w:gutter="0"/>
           <w:pgNumType w:start="1"/>
           <w:cols w:space="720"/>
         </w:sectPr>
@@ -4353,7 +4700,10 @@
     </w:p>
     <w:p>
       <w:pPr>
-        <w:spacing w:before="72"/>
+        <w:keepNext/>
+        <w:pageBreakBefore w:val="0"/>
+        <w:widowControl/>
+        <w:spacing w:before="40" w:after="80"/>
         <w:ind w:left="360"/>
         <w:jc w:val="center"/>
         <w:rPr>
@@ -4444,6 +4794,9 @@
     <w:p>
       <w:pPr>
         <w:pStyle w:val="Heading2"/>
+        <w:keepNext/>
+        <w:pageBreakBefore w:val="0"/>
+        <w:widowControl/>
         <w:numPr>
           <w:ilvl w:val="0"/>
           <w:numId w:val="1"/>
@@ -4451,7 +4804,7 @@
         <w:tabs>
           <w:tab w:val="left" w:pos="508"/>
         </w:tabs>
-        <w:spacing w:before="80"/>
+        <w:spacing w:before="40" w:after="80"/>
         <w:ind w:left="508" w:hanging="218"/>
       </w:pPr>
       <w:bookmarkStart w:name="8._Testing_and_Validation" w:id="8"/>
@@ -4494,7 +4847,9 @@
       <w:pPr>
         <w:pStyle w:val="BodyText"/>
         <w:keepNext w:val="0"/>
-        <w:spacing w:before="40" w:after="41"/>
+        <w:pageBreakBefore w:val="0"/>
+        <w:widowControl/>
+        <w:spacing w:before="40" w:after="80"/>
         <w:ind w:left="290" w:firstLine="0"/>
       </w:pPr>
       <w:r>
@@ -4570,6 +4925,50 @@
         <w:rPr>
           <w:spacing w:val="-2"/>
         </w:rPr>
+      </w:r>
+    </w:p>
+    <w:p>
+      <w:pPr>
+        <w:pStyle w:val="BodyText"/>
+        <w:keepNext/>
+        <w:pageBreakBefore w:val="0"/>
+        <w:widowControl/>
+        <w:tabs>
+          <w:tab w:val="left" w:pos="2193"/>
+          <w:tab w:val="left" w:pos="5264"/>
+          <w:tab w:val="left" w:pos="7644"/>
+          <w:tab w:val="left" w:pos="7794"/>
+        </w:tabs>
+        <w:spacing w:before="40" w:line="285" w:lineRule="auto" w:after="80"/>
+        <w:ind w:left="290" w:right="2643" w:firstLine="0"/>
+      </w:pPr>
+      <w:r>
+        <w:rPr>
+          <w:b/>
+        </w:rPr>
+        <w:t>Interpretation of forecast errors</w:t>
+      </w:r>
+    </w:p>
+    <w:p>
+      <w:pPr>
+        <w:pStyle w:val="BodyText"/>
+        <w:keepNext w:val="0"/>
+        <w:pageBreakBefore w:val="0"/>
+        <w:widowControl/>
+        <w:tabs>
+          <w:tab w:val="left" w:pos="2193"/>
+          <w:tab w:val="left" w:pos="5264"/>
+          <w:tab w:val="left" w:pos="7644"/>
+          <w:tab w:val="left" w:pos="7794"/>
+        </w:tabs>
+        <w:spacing w:before="40" w:line="285" w:lineRule="auto" w:after="80"/>
+        <w:ind w:left="290" w:right="2643" w:firstLine="0"/>
+      </w:pPr>
+      <w:r>
+        <w:rPr>
+          <w:b w:val="0"/>
+        </w:rPr>
+        <w:t>For observed demand y and prediction f over n months, MAE = sum(|y âˆ’ f|)/n and RMSE = sqrt(sum((y âˆ’ f)^2)/n). Both retain the demand unit; RMSE gives larger errors more weight and is therefore useful when severe shortages matter. MAPE = 100 Ã— mean(|(y âˆ’ f)/y|) over nonzero observations. It gives a percentage comparison but is undefined at zero and unstable near zero. A low average error does not imply that every peak-demand month is forecast accurately, so the month-by-month comparison remains necessary.</w:t>
       </w:r>
     </w:p>
     <w:tbl>
@@ -5753,7 +6152,9 @@
     <w:p>
       <w:pPr>
         <w:pStyle w:val="Heading2"/>
-        <w:pageBreakBefore/>
+        <w:keepNext/>
+        <w:pageBreakBefore w:val="0"/>
+        <w:widowControl/>
         <w:numPr>
           <w:ilvl w:val="0"/>
           <w:numId w:val="1"/>
@@ -5761,7 +6162,7 @@
         <w:tabs>
           <w:tab w:val="left" w:pos="508"/>
         </w:tabs>
-        <w:spacing w:before="81"/>
+        <w:spacing w:before="40" w:after="80"/>
         <w:ind w:left="508" w:hanging="218"/>
       </w:pPr>
       <w:bookmarkStart w:name="9._Results_and_Discussion" w:id="9"/>
@@ -5804,10 +6205,12 @@
       <w:pPr>
         <w:pStyle w:val="BodyText"/>
         <w:keepNext w:val="0"/>
+        <w:pageBreakBefore w:val="0"/>
+        <w:widowControl/>
         <w:tabs>
           <w:tab w:val="left" w:pos="577"/>
         </w:tabs>
-        <w:spacing w:before="39" w:line="219" w:lineRule="exact"/>
+        <w:spacing w:before="40" w:line="219" w:lineRule="exact" w:after="80"/>
         <w:ind w:left="577" w:hanging="172"/>
         <w:rPr>
           <w:sz w:val="19"/>
@@ -5992,7 +6395,7 @@
           </w:tcPr>
           <w:p>
             <w:pPr>
-              <w:keepNext w:val="0"/>
+              <w:keepNext/>
               <w:spacing w:after="40" w:before="40"/>
             </w:pPr>
             <w:r>
@@ -6017,7 +6420,7 @@
           </w:tcPr>
           <w:p>
             <w:pPr>
-              <w:keepNext w:val="0"/>
+              <w:keepNext/>
               <w:spacing w:after="40" w:before="40"/>
             </w:pPr>
             <w:r>
@@ -6042,7 +6445,7 @@
           </w:tcPr>
           <w:p>
             <w:pPr>
-              <w:keepNext w:val="0"/>
+              <w:keepNext/>
               <w:spacing w:after="40" w:before="40"/>
             </w:pPr>
             <w:r>
@@ -6067,7 +6470,7 @@
           </w:tcPr>
           <w:p>
             <w:pPr>
-              <w:keepNext w:val="0"/>
+              <w:keepNext/>
               <w:spacing w:after="40" w:before="40"/>
             </w:pPr>
             <w:r>
@@ -6092,7 +6495,7 @@
           </w:tcPr>
           <w:p>
             <w:pPr>
-              <w:keepNext w:val="0"/>
+              <w:keepNext/>
               <w:spacing w:after="40" w:before="40"/>
             </w:pPr>
             <w:r>
@@ -6122,7 +6525,7 @@
           </w:tcPr>
           <w:p>
             <w:pPr>
-              <w:keepNext w:val="0"/>
+              <w:keepNext/>
               <w:spacing w:after="40" w:before="40"/>
             </w:pPr>
             <w:r>
@@ -6147,7 +6550,7 @@
           </w:tcPr>
           <w:p>
             <w:pPr>
-              <w:keepNext w:val="0"/>
+              <w:keepNext/>
               <w:spacing w:after="40" w:before="40"/>
             </w:pPr>
             <w:r>
@@ -6172,7 +6575,7 @@
           </w:tcPr>
           <w:p>
             <w:pPr>
-              <w:keepNext w:val="0"/>
+              <w:keepNext/>
               <w:spacing w:after="40" w:before="40"/>
             </w:pPr>
             <w:r>
@@ -6197,7 +6600,7 @@
           </w:tcPr>
           <w:p>
             <w:pPr>
-              <w:keepNext w:val="0"/>
+              <w:keepNext/>
               <w:spacing w:after="40" w:before="40"/>
             </w:pPr>
             <w:r>
@@ -6222,7 +6625,7 @@
           </w:tcPr>
           <w:p>
             <w:pPr>
-              <w:keepNext w:val="0"/>
+              <w:keepNext/>
               <w:spacing w:after="40" w:before="40"/>
             </w:pPr>
             <w:r>
@@ -6252,7 +6655,7 @@
           </w:tcPr>
           <w:p>
             <w:pPr>
-              <w:keepNext w:val="0"/>
+              <w:keepNext/>
               <w:spacing w:after="40" w:before="40"/>
             </w:pPr>
             <w:r>
@@ -6277,7 +6680,7 @@
           </w:tcPr>
           <w:p>
             <w:pPr>
-              <w:keepNext w:val="0"/>
+              <w:keepNext/>
               <w:spacing w:after="40" w:before="40"/>
             </w:pPr>
             <w:r>
@@ -6302,7 +6705,7 @@
           </w:tcPr>
           <w:p>
             <w:pPr>
-              <w:keepNext w:val="0"/>
+              <w:keepNext/>
               <w:spacing w:after="40" w:before="40"/>
             </w:pPr>
             <w:r>
@@ -6327,7 +6730,7 @@
           </w:tcPr>
           <w:p>
             <w:pPr>
-              <w:keepNext w:val="0"/>
+              <w:keepNext/>
               <w:spacing w:after="40" w:before="40"/>
             </w:pPr>
             <w:r>
@@ -6352,7 +6755,7 @@
           </w:tcPr>
           <w:p>
             <w:pPr>
-              <w:keepNext w:val="0"/>
+              <w:keepNext/>
               <w:spacing w:after="40" w:before="40"/>
             </w:pPr>
             <w:r>
@@ -6382,7 +6785,7 @@
           </w:tcPr>
           <w:p>
             <w:pPr>
-              <w:keepNext w:val="0"/>
+              <w:keepNext/>
               <w:spacing w:after="40" w:before="40"/>
             </w:pPr>
             <w:r>
@@ -6407,7 +6810,7 @@
           </w:tcPr>
           <w:p>
             <w:pPr>
-              <w:keepNext w:val="0"/>
+              <w:keepNext/>
               <w:spacing w:after="40" w:before="40"/>
             </w:pPr>
             <w:r>
@@ -6432,7 +6835,7 @@
           </w:tcPr>
           <w:p>
             <w:pPr>
-              <w:keepNext w:val="0"/>
+              <w:keepNext/>
               <w:spacing w:after="40" w:before="40"/>
             </w:pPr>
             <w:r>
@@ -6457,7 +6860,7 @@
           </w:tcPr>
           <w:p>
             <w:pPr>
-              <w:keepNext w:val="0"/>
+              <w:keepNext/>
               <w:spacing w:after="40" w:before="40"/>
             </w:pPr>
             <w:r>
@@ -6482,7 +6885,7 @@
           </w:tcPr>
           <w:p>
             <w:pPr>
-              <w:keepNext w:val="0"/>
+              <w:keepNext/>
               <w:spacing w:after="40" w:before="40"/>
             </w:pPr>
             <w:r>
@@ -6629,16 +7032,10 @@
     <w:p>
       <w:pPr>
         <w:pStyle w:val="BodyText"/>
-        <w:keepNext w:val="0"/>
-        <w:spacing w:before="39"/>
-        <w:ind w:left="290" w:firstLine="0"/>
-      </w:pPr>
-    </w:p>
-    <w:p>
-      <w:pPr>
-        <w:pStyle w:val="BodyText"/>
         <w:keepNext/>
-        <w:spacing w:before="39" w:after="120"/>
+        <w:pageBreakBefore w:val="0"/>
+        <w:widowControl/>
+        <w:spacing w:before="40" w:after="80"/>
         <w:ind w:left="290" w:firstLine="0"/>
         <w:jc w:val="center"/>
       </w:pPr>
@@ -6686,7 +7083,9 @@
       <w:pPr>
         <w:pStyle w:val="BodyText"/>
         <w:keepNext w:val="0"/>
-        <w:spacing w:before="39" w:after="120"/>
+        <w:pageBreakBefore w:val="0"/>
+        <w:widowControl/>
+        <w:spacing w:before="40" w:after="80"/>
         <w:ind w:left="290" w:firstLine="0"/>
         <w:jc w:val="center"/>
       </w:pPr>
@@ -6701,9 +7100,12 @@
       <w:pPr>
         <w:pStyle w:val="BodyText"/>
         <w:keepNext w:val="0"/>
+        <w:pageBreakBefore w:val="0"/>
+        <w:widowControl/>
         <w:tabs>
           <w:tab w:val="left" w:pos="578"/>
         </w:tabs>
+        <w:spacing w:before="40" w:after="80"/>
         <w:ind w:right="11"/>
         <w:rPr>
           <w:sz w:val="19"/>
@@ -6907,9 +7309,12 @@
       <w:pPr>
         <w:pStyle w:val="BodyText"/>
         <w:keepNext w:val="0"/>
+        <w:pageBreakBefore w:val="0"/>
+        <w:widowControl/>
         <w:tabs>
           <w:tab w:val="left" w:pos="577"/>
         </w:tabs>
+        <w:spacing w:before="40" w:after="80"/>
         <w:ind w:left="577" w:hanging="172"/>
         <w:rPr>
           <w:sz w:val="19"/>
@@ -7047,9 +7452,10 @@
     <w:p>
       <w:pPr>
         <w:pStyle w:val="BodyText"/>
-        <w:keepNext w:val="0"/>
-        <w:pageBreakBefore/>
-        <w:spacing w:before="39" w:after="120"/>
+        <w:keepNext/>
+        <w:pageBreakBefore w:val="0"/>
+        <w:widowControl/>
+        <w:spacing w:before="40" w:after="80"/>
         <w:ind w:left="290" w:firstLine="0"/>
       </w:pPr>
       <w:r>
@@ -7063,7 +7469,9 @@
       <w:pPr>
         <w:pStyle w:val="BodyText"/>
         <w:keepNext/>
-        <w:spacing w:before="39" w:after="120"/>
+        <w:pageBreakBefore w:val="0"/>
+        <w:widowControl/>
+        <w:spacing w:before="40" w:after="80"/>
         <w:ind w:left="290" w:firstLine="0"/>
         <w:jc w:val="center"/>
       </w:pPr>
@@ -7111,7 +7519,9 @@
       <w:pPr>
         <w:pStyle w:val="BodyText"/>
         <w:keepNext w:val="0"/>
-        <w:spacing w:before="39" w:after="120"/>
+        <w:pageBreakBefore w:val="0"/>
+        <w:widowControl/>
+        <w:spacing w:before="40" w:after="80"/>
         <w:ind w:left="290" w:firstLine="0"/>
         <w:jc w:val="center"/>
       </w:pPr>
@@ -7126,7 +7536,9 @@
       <w:pPr>
         <w:pStyle w:val="BodyText"/>
         <w:keepNext/>
-        <w:spacing w:before="39" w:after="120"/>
+        <w:pageBreakBefore w:val="0"/>
+        <w:widowControl/>
+        <w:spacing w:before="40" w:after="80"/>
         <w:ind w:left="290" w:firstLine="0"/>
         <w:jc w:val="center"/>
       </w:pPr>
@@ -7174,7 +7586,9 @@
       <w:pPr>
         <w:pStyle w:val="BodyText"/>
         <w:keepNext w:val="0"/>
-        <w:spacing w:before="39" w:after="120"/>
+        <w:pageBreakBefore w:val="0"/>
+        <w:widowControl/>
+        <w:spacing w:before="40" w:after="80"/>
         <w:ind w:left="290" w:firstLine="0"/>
         <w:jc w:val="center"/>
       </w:pPr>
@@ -7189,7 +7603,9 @@
       <w:pPr>
         <w:pStyle w:val="BodyText"/>
         <w:keepNext w:val="0"/>
-        <w:spacing w:before="39" w:after="120"/>
+        <w:pageBreakBefore w:val="0"/>
+        <w:widowControl/>
+        <w:spacing w:before="40" w:after="80"/>
         <w:ind w:left="290" w:firstLine="0"/>
       </w:pPr>
       <w:r>
@@ -7202,9 +7618,10 @@
     <w:p>
       <w:pPr>
         <w:pStyle w:val="BodyText"/>
-        <w:keepNext w:val="0"/>
-        <w:pageBreakBefore/>
-        <w:spacing w:before="39" w:after="120"/>
+        <w:keepNext/>
+        <w:pageBreakBefore w:val="0"/>
+        <w:widowControl/>
+        <w:spacing w:before="40" w:after="80"/>
         <w:ind w:left="290" w:firstLine="0"/>
       </w:pPr>
       <w:r>
@@ -7218,7 +7635,9 @@
       <w:pPr>
         <w:pStyle w:val="BodyText"/>
         <w:keepNext/>
-        <w:spacing w:before="39" w:after="120"/>
+        <w:pageBreakBefore w:val="0"/>
+        <w:widowControl/>
+        <w:spacing w:before="40" w:after="80"/>
         <w:ind w:left="290" w:firstLine="0"/>
         <w:jc w:val="center"/>
       </w:pPr>
@@ -7266,7 +7685,9 @@
       <w:pPr>
         <w:pStyle w:val="BodyText"/>
         <w:keepNext w:val="0"/>
-        <w:spacing w:before="39" w:after="120"/>
+        <w:pageBreakBefore w:val="0"/>
+        <w:widowControl/>
+        <w:spacing w:before="40" w:after="80"/>
         <w:ind w:left="290" w:firstLine="0"/>
         <w:jc w:val="center"/>
       </w:pPr>
@@ -7316,7 +7737,7 @@
           </w:tcPr>
           <w:p>
             <w:pPr>
-              <w:keepNext w:val="0"/>
+              <w:keepNext/>
               <w:spacing w:after="40" w:before="40"/>
             </w:pPr>
             <w:r>
@@ -7341,7 +7762,7 @@
           </w:tcPr>
           <w:p>
             <w:pPr>
-              <w:keepNext w:val="0"/>
+              <w:keepNext/>
               <w:spacing w:after="40" w:before="40"/>
             </w:pPr>
             <w:r>
@@ -7366,7 +7787,7 @@
           </w:tcPr>
           <w:p>
             <w:pPr>
-              <w:keepNext w:val="0"/>
+              <w:keepNext/>
               <w:spacing w:after="40" w:before="40"/>
             </w:pPr>
             <w:r>
@@ -7391,7 +7812,7 @@
           </w:tcPr>
           <w:p>
             <w:pPr>
-              <w:keepNext w:val="0"/>
+              <w:keepNext/>
               <w:spacing w:after="40" w:before="40"/>
             </w:pPr>
             <w:r>
@@ -7416,7 +7837,7 @@
           </w:tcPr>
           <w:p>
             <w:pPr>
-              <w:keepNext w:val="0"/>
+              <w:keepNext/>
               <w:spacing w:after="40" w:before="40"/>
             </w:pPr>
             <w:r>
@@ -7446,7 +7867,7 @@
           </w:tcPr>
           <w:p>
             <w:pPr>
-              <w:keepNext w:val="0"/>
+              <w:keepNext/>
               <w:spacing w:after="40" w:before="40"/>
             </w:pPr>
             <w:r>
@@ -7471,7 +7892,7 @@
           </w:tcPr>
           <w:p>
             <w:pPr>
-              <w:keepNext w:val="0"/>
+              <w:keepNext/>
               <w:spacing w:after="40" w:before="40"/>
             </w:pPr>
             <w:r>
@@ -7496,7 +7917,7 @@
           </w:tcPr>
           <w:p>
             <w:pPr>
-              <w:keepNext w:val="0"/>
+              <w:keepNext/>
               <w:spacing w:after="40" w:before="40"/>
             </w:pPr>
             <w:r>
@@ -7521,7 +7942,7 @@
           </w:tcPr>
           <w:p>
             <w:pPr>
-              <w:keepNext w:val="0"/>
+              <w:keepNext/>
               <w:spacing w:after="40" w:before="40"/>
             </w:pPr>
             <w:r>
@@ -7546,7 +7967,7 @@
           </w:tcPr>
           <w:p>
             <w:pPr>
-              <w:keepNext w:val="0"/>
+              <w:keepNext/>
               <w:spacing w:after="40" w:before="40"/>
             </w:pPr>
             <w:r>
@@ -7576,7 +7997,7 @@
           </w:tcPr>
           <w:p>
             <w:pPr>
-              <w:keepNext w:val="0"/>
+              <w:keepNext/>
               <w:spacing w:after="40" w:before="40"/>
             </w:pPr>
             <w:r>
@@ -7601,7 +8022,7 @@
           </w:tcPr>
           <w:p>
             <w:pPr>
-              <w:keepNext w:val="0"/>
+              <w:keepNext/>
               <w:spacing w:after="40" w:before="40"/>
             </w:pPr>
             <w:r>
@@ -7626,7 +8047,7 @@
           </w:tcPr>
           <w:p>
             <w:pPr>
-              <w:keepNext w:val="0"/>
+              <w:keepNext/>
               <w:spacing w:after="40" w:before="40"/>
             </w:pPr>
             <w:r>
@@ -7651,7 +8072,7 @@
           </w:tcPr>
           <w:p>
             <w:pPr>
-              <w:keepNext w:val="0"/>
+              <w:keepNext/>
               <w:spacing w:after="40" w:before="40"/>
             </w:pPr>
             <w:r>
@@ -7676,7 +8097,7 @@
           </w:tcPr>
           <w:p>
             <w:pPr>
-              <w:keepNext w:val="0"/>
+              <w:keepNext/>
               <w:spacing w:after="40" w:before="40"/>
             </w:pPr>
             <w:r>
@@ -7706,7 +8127,7 @@
           </w:tcPr>
           <w:p>
             <w:pPr>
-              <w:keepNext w:val="0"/>
+              <w:keepNext/>
               <w:spacing w:after="40" w:before="40"/>
             </w:pPr>
             <w:r>
@@ -7731,7 +8152,7 @@
           </w:tcPr>
           <w:p>
             <w:pPr>
-              <w:keepNext w:val="0"/>
+              <w:keepNext/>
               <w:spacing w:after="40" w:before="40"/>
             </w:pPr>
             <w:r>
@@ -7756,7 +8177,7 @@
           </w:tcPr>
           <w:p>
             <w:pPr>
-              <w:keepNext w:val="0"/>
+              <w:keepNext/>
               <w:spacing w:after="40" w:before="40"/>
             </w:pPr>
             <w:r>
@@ -7781,7 +8202,7 @@
           </w:tcPr>
           <w:p>
             <w:pPr>
-              <w:keepNext w:val="0"/>
+              <w:keepNext/>
               <w:spacing w:after="40" w:before="40"/>
             </w:pPr>
             <w:r>
@@ -7806,7 +8227,7 @@
           </w:tcPr>
           <w:p>
             <w:pPr>
-              <w:keepNext w:val="0"/>
+              <w:keepNext/>
               <w:spacing w:after="40" w:before="40"/>
             </w:pPr>
             <w:r>
@@ -7954,58 +8375,57 @@
       <w:pPr>
         <w:pStyle w:val="BodyText"/>
         <w:keepNext w:val="0"/>
-        <w:spacing w:before="39"/>
+        <w:pageBreakBefore w:val="0"/>
+        <w:widowControl/>
+        <w:spacing w:before="40" w:after="80"/>
         <w:ind w:left="290" w:firstLine="0"/>
       </w:pPr>
+      <w:r>
+        <w:rPr>
+          <w:b w:val="0"/>
+        </w:rPr>
+        <w:t>Each month is compared with its year-earlier demand. The detector uses only prior residuals to estimate a 24-month median and MAD, with at least 12 residuals required. Initial months are unscored. A score beyond ±3.5 triggers investigation. Review billing corrections, drought restrictions, leaks, unusual events and weather. Available weather can suggest associations, but no flagged month is a confirmed leak. Without incident labels, anomaly precision and recall cannot be reported.</w:t>
+      </w:r>
     </w:p>
     <w:p>
       <w:pPr>
         <w:pStyle w:val="BodyText"/>
         <w:keepNext w:val="0"/>
-        <w:spacing w:before="39" w:after="120"/>
+        <w:pageBreakBefore w:val="0"/>
+        <w:widowControl/>
+        <w:spacing w:before="40" w:after="80"/>
         <w:ind w:left="290" w:firstLine="0"/>
       </w:pPr>
       <w:r>
         <w:rPr>
           <w:b w:val="0"/>
         </w:rPr>
-        <w:t>Each month is compared with its year-earlier demand. The detector uses only prior residuals to estimate a 24-month median and MAD, with at least 12 residuals required. Initial months are unscored. A score beyond ±3.5 triggers investigation. Review billing corrections, drought restrictions, leaks, unusual events and weather. Available weather can suggest associations, but no flagged month is a confirmed leak. Without incident labels, anomaly precision and recall cannot be reported.</w:t>
+        <w:t>Year-earlier weather comparisons provide limited explanations. October 2019 demand rose by 1,268.88 MG while rainfall fell by 69.8 mm, consistent with increased irrigation as a hypothesis. August 2024 demand fell by 1,052.64 MG while mean temperature fell by 2.24 C, potentially reducing outdoor demand. October 2015 was substantially wetter despite higher demand, and August 2022 had only modest weather changes; those increases need billing, restriction or incident records to explain.</w:t>
       </w:r>
     </w:p>
     <w:p>
       <w:pPr>
         <w:pStyle w:val="BodyText"/>
-        <w:keepNext w:val="0"/>
-        <w:spacing w:before="39" w:after="120"/>
+        <w:keepNext/>
+        <w:pageBreakBefore w:val="0"/>
+        <w:widowControl/>
+        <w:spacing w:before="40" w:after="80"/>
         <w:ind w:left="290" w:firstLine="0"/>
       </w:pPr>
       <w:r>
         <w:rPr>
-          <w:b w:val="0"/>
-        </w:rPr>
-        <w:t>Year-earlier weather comparisons provide limited explanations. October 2019 demand rose by 1,268.88 MG while rainfall fell by 69.8 mm, consistent with increased irrigation as a hypothesis. August 2024 demand fell by 1,052.64 MG while mean temperature fell by 2.24 C, potentially reducing outdoor demand. October 2015 was substantially wetter despite higher demand, and August 2022 had only modest weather changes; those increases need billing, restriction or incident records to explain.</w:t>
+          <w:b/>
+        </w:rPr>
+        <w:t>Alternative distribution scenarios</w:t>
       </w:r>
     </w:p>
     <w:p>
       <w:pPr>
         <w:pStyle w:val="BodyText"/>
         <w:keepNext w:val="0"/>
-        <w:pageBreakBefore/>
-        <w:spacing w:before="39" w:after="120"/>
-        <w:ind w:left="290" w:firstLine="0"/>
-      </w:pPr>
-      <w:r>
-        <w:rPr>
-          <w:b/>
-        </w:rPr>
-        <w:t>Alternative distribution scenarios</w:t>
-      </w:r>
-    </w:p>
-    <w:p>
-      <w:pPr>
-        <w:pStyle w:val="BodyText"/>
-        <w:keepNext w:val="0"/>
-        <w:spacing w:before="39" w:after="120"/>
+        <w:pageBreakBefore w:val="0"/>
+        <w:widowControl/>
+        <w:spacing w:before="40" w:after="80"/>
         <w:ind w:left="290" w:firstLine="0"/>
       </w:pPr>
       <w:r>
@@ -8054,7 +8474,7 @@
           </w:tcPr>
           <w:p>
             <w:pPr>
-              <w:keepNext w:val="0"/>
+              <w:keepNext/>
               <w:spacing w:after="40" w:before="40"/>
             </w:pPr>
             <w:r>
@@ -8079,7 +8499,7 @@
           </w:tcPr>
           <w:p>
             <w:pPr>
-              <w:keepNext w:val="0"/>
+              <w:keepNext/>
               <w:spacing w:after="40" w:before="40"/>
             </w:pPr>
             <w:r>
@@ -8104,7 +8524,7 @@
           </w:tcPr>
           <w:p>
             <w:pPr>
-              <w:keepNext w:val="0"/>
+              <w:keepNext/>
               <w:spacing w:after="40" w:before="40"/>
             </w:pPr>
             <w:r>
@@ -8129,7 +8549,7 @@
           </w:tcPr>
           <w:p>
             <w:pPr>
-              <w:keepNext w:val="0"/>
+              <w:keepNext/>
               <w:spacing w:after="40" w:before="40"/>
             </w:pPr>
             <w:r>
@@ -8154,7 +8574,7 @@
           </w:tcPr>
           <w:p>
             <w:pPr>
-              <w:keepNext w:val="0"/>
+              <w:keepNext/>
               <w:spacing w:after="40" w:before="40"/>
             </w:pPr>
             <w:r>
@@ -8184,7 +8604,7 @@
           </w:tcPr>
           <w:p>
             <w:pPr>
-              <w:keepNext w:val="0"/>
+              <w:keepNext/>
               <w:spacing w:after="40" w:before="40"/>
             </w:pPr>
             <w:r>
@@ -8209,7 +8629,7 @@
           </w:tcPr>
           <w:p>
             <w:pPr>
-              <w:keepNext w:val="0"/>
+              <w:keepNext/>
               <w:spacing w:after="40" w:before="40"/>
             </w:pPr>
             <w:r>
@@ -8234,7 +8654,7 @@
           </w:tcPr>
           <w:p>
             <w:pPr>
-              <w:keepNext w:val="0"/>
+              <w:keepNext/>
               <w:spacing w:after="40" w:before="40"/>
             </w:pPr>
             <w:r>
@@ -8259,7 +8679,7 @@
           </w:tcPr>
           <w:p>
             <w:pPr>
-              <w:keepNext w:val="0"/>
+              <w:keepNext/>
               <w:spacing w:after="40" w:before="40"/>
             </w:pPr>
             <w:r>
@@ -8284,7 +8704,7 @@
           </w:tcPr>
           <w:p>
             <w:pPr>
-              <w:keepNext w:val="0"/>
+              <w:keepNext/>
               <w:spacing w:after="40" w:before="40"/>
             </w:pPr>
             <w:r>
@@ -8314,7 +8734,7 @@
           </w:tcPr>
           <w:p>
             <w:pPr>
-              <w:keepNext w:val="0"/>
+              <w:keepNext/>
               <w:spacing w:after="40" w:before="40"/>
             </w:pPr>
             <w:r>
@@ -8339,7 +8759,7 @@
           </w:tcPr>
           <w:p>
             <w:pPr>
-              <w:keepNext w:val="0"/>
+              <w:keepNext/>
               <w:spacing w:after="40" w:before="40"/>
             </w:pPr>
             <w:r>
@@ -8364,7 +8784,7 @@
           </w:tcPr>
           <w:p>
             <w:pPr>
-              <w:keepNext w:val="0"/>
+              <w:keepNext/>
               <w:spacing w:after="40" w:before="40"/>
             </w:pPr>
             <w:r>
@@ -8389,7 +8809,7 @@
           </w:tcPr>
           <w:p>
             <w:pPr>
-              <w:keepNext w:val="0"/>
+              <w:keepNext/>
               <w:spacing w:after="40" w:before="40"/>
             </w:pPr>
             <w:r>
@@ -8414,7 +8834,7 @@
           </w:tcPr>
           <w:p>
             <w:pPr>
-              <w:keepNext w:val="0"/>
+              <w:keepNext/>
               <w:spacing w:after="40" w:before="40"/>
             </w:pPr>
             <w:r>
@@ -8444,7 +8864,7 @@
           </w:tcPr>
           <w:p>
             <w:pPr>
-              <w:keepNext w:val="0"/>
+              <w:keepNext/>
               <w:spacing w:after="40" w:before="40"/>
             </w:pPr>
             <w:r>
@@ -8469,7 +8889,7 @@
           </w:tcPr>
           <w:p>
             <w:pPr>
-              <w:keepNext w:val="0"/>
+              <w:keepNext/>
               <w:spacing w:after="40" w:before="40"/>
             </w:pPr>
             <w:r>
@@ -8494,7 +8914,7 @@
           </w:tcPr>
           <w:p>
             <w:pPr>
-              <w:keepNext w:val="0"/>
+              <w:keepNext/>
               <w:spacing w:after="40" w:before="40"/>
             </w:pPr>
             <w:r>
@@ -8519,7 +8939,7 @@
           </w:tcPr>
           <w:p>
             <w:pPr>
-              <w:keepNext w:val="0"/>
+              <w:keepNext/>
               <w:spacing w:after="40" w:before="40"/>
             </w:pPr>
             <w:r>
@@ -8544,7 +8964,7 @@
           </w:tcPr>
           <w:p>
             <w:pPr>
-              <w:keepNext w:val="0"/>
+              <w:keepNext/>
               <w:spacing w:after="40" w:before="40"/>
             </w:pPr>
             <w:r>
@@ -8692,44 +9112,41 @@
       <w:pPr>
         <w:pStyle w:val="BodyText"/>
         <w:keepNext w:val="0"/>
-        <w:spacing w:before="39"/>
+        <w:pageBreakBefore w:val="0"/>
+        <w:widowControl/>
+        <w:spacing w:before="40" w:after="80"/>
         <w:ind w:left="290" w:firstLine="0"/>
       </w:pPr>
+      <w:r>
+        <w:rPr>
+          <w:b w:val="0"/>
+        </w:rPr>
+        <w:t>At 35% supply, only 1,188.13 MG is available while the assumed minimum floors require approximately 1,956.88 MG. The system therefore reports infeasibility and an emergency fallback, including floor violations. Additional water, temporary distribution, demand restrictions or restored capacity are required. A sector cap below its floor also makes service infeasible even when aggregate supply is sufficient.</w:t>
+      </w:r>
     </w:p>
     <w:p>
       <w:pPr>
         <w:pStyle w:val="BodyText"/>
-        <w:keepNext w:val="0"/>
-        <w:spacing w:before="39" w:after="120"/>
+        <w:keepNext/>
+        <w:pageBreakBefore w:val="0"/>
+        <w:widowControl/>
+        <w:spacing w:before="40" w:after="80"/>
         <w:ind w:left="290" w:firstLine="0"/>
       </w:pPr>
       <w:r>
         <w:rPr>
-          <w:b w:val="0"/>
-        </w:rPr>
-        <w:t>At 35% supply, only 1,188.13 MG is available while the assumed minimum floors require approximately 1,956.88 MG. The system therefore reports infeasibility and an emergency fallback, including floor violations. Additional water, temporary distribution, demand restrictions or restored capacity are required. A sector cap below its floor also makes service infeasible even when aggregate supply is sufficient.</w:t>
+          <w:b/>
+        </w:rPr>
+        <w:t>Decision support demonstration</w:t>
       </w:r>
     </w:p>
     <w:p>
       <w:pPr>
         <w:pStyle w:val="BodyText"/>
-        <w:keepNext w:val="0"/>
-        <w:pageBreakBefore/>
-        <w:spacing w:before="39" w:after="120"/>
-        <w:ind w:left="290" w:firstLine="0"/>
-      </w:pPr>
-      <w:r>
-        <w:rPr>
-          <w:b/>
-        </w:rPr>
-        <w:t>Decision support demonstration</w:t>
-      </w:r>
-    </w:p>
-    <w:p>
-      <w:pPr>
-        <w:pStyle w:val="BodyText"/>
         <w:keepNext/>
-        <w:spacing w:before="39" w:after="120"/>
+        <w:pageBreakBefore w:val="0"/>
+        <w:widowControl/>
+        <w:spacing w:before="40" w:after="80"/>
         <w:ind w:left="290" w:firstLine="0"/>
         <w:jc w:val="center"/>
       </w:pPr>
@@ -8777,7 +9194,9 @@
       <w:pPr>
         <w:pStyle w:val="BodyText"/>
         <w:keepNext w:val="0"/>
-        <w:spacing w:before="39" w:after="120"/>
+        <w:pageBreakBefore w:val="0"/>
+        <w:widowControl/>
+        <w:spacing w:before="40" w:after="80"/>
         <w:ind w:left="290" w:firstLine="0"/>
         <w:jc w:val="center"/>
       </w:pPr>
@@ -8792,7 +9211,9 @@
       <w:pPr>
         <w:pStyle w:val="BodyText"/>
         <w:keepNext w:val="0"/>
-        <w:spacing w:before="39" w:after="120"/>
+        <w:pageBreakBefore w:val="0"/>
+        <w:widowControl/>
+        <w:spacing w:before="40" w:after="80"/>
         <w:ind w:left="290" w:firstLine="0"/>
       </w:pPr>
       <w:r>
@@ -8805,9 +9226,10 @@
     <w:p>
       <w:pPr>
         <w:pStyle w:val="BodyText"/>
-        <w:keepNext w:val="0"/>
-        <w:pageBreakBefore/>
-        <w:spacing w:before="39" w:after="120"/>
+        <w:keepNext/>
+        <w:pageBreakBefore w:val="0"/>
+        <w:widowControl/>
+        <w:spacing w:before="40" w:after="80"/>
         <w:ind w:left="290" w:firstLine="0"/>
       </w:pPr>
       <w:r>
@@ -8821,7 +9243,9 @@
       <w:pPr>
         <w:pStyle w:val="BodyText"/>
         <w:keepNext w:val="0"/>
-        <w:spacing w:before="39" w:after="120"/>
+        <w:pageBreakBefore w:val="0"/>
+        <w:widowControl/>
+        <w:spacing w:before="40" w:after="80"/>
         <w:ind w:left="290" w:firstLine="0"/>
       </w:pPr>
       <w:r>
@@ -8835,7 +9259,9 @@
       <w:pPr>
         <w:pStyle w:val="BodyText"/>
         <w:keepNext/>
-        <w:spacing w:before="39" w:after="120"/>
+        <w:pageBreakBefore w:val="0"/>
+        <w:widowControl/>
+        <w:spacing w:before="40" w:after="80"/>
         <w:ind w:left="290" w:firstLine="0"/>
         <w:jc w:val="center"/>
       </w:pPr>
@@ -8883,7 +9309,9 @@
       <w:pPr>
         <w:pStyle w:val="BodyText"/>
         <w:keepNext w:val="0"/>
-        <w:spacing w:before="39" w:after="120"/>
+        <w:pageBreakBefore w:val="0"/>
+        <w:widowControl/>
+        <w:spacing w:before="40" w:after="80"/>
         <w:ind w:left="290" w:firstLine="0"/>
         <w:jc w:val="center"/>
       </w:pPr>
@@ -8897,9 +9325,10 @@
     <w:p>
       <w:pPr>
         <w:pStyle w:val="BodyText"/>
-        <w:keepNext w:val="0"/>
-        <w:pageBreakBefore/>
-        <w:spacing w:before="39" w:after="120"/>
+        <w:keepNext/>
+        <w:pageBreakBefore w:val="0"/>
+        <w:widowControl/>
+        <w:spacing w:before="40" w:after="80"/>
         <w:ind w:left="290" w:firstLine="0"/>
       </w:pPr>
       <w:r>
@@ -8913,7 +9342,9 @@
       <w:pPr>
         <w:pStyle w:val="BodyText"/>
         <w:keepNext/>
-        <w:spacing w:before="39" w:after="120"/>
+        <w:pageBreakBefore w:val="0"/>
+        <w:widowControl/>
+        <w:spacing w:before="40" w:after="80"/>
         <w:ind w:left="290" w:firstLine="0"/>
         <w:jc w:val="center"/>
       </w:pPr>
@@ -8961,7 +9392,9 @@
       <w:pPr>
         <w:pStyle w:val="BodyText"/>
         <w:keepNext w:val="0"/>
-        <w:spacing w:before="39" w:after="120"/>
+        <w:pageBreakBefore w:val="0"/>
+        <w:widowControl/>
+        <w:spacing w:before="40" w:after="80"/>
         <w:ind w:left="290" w:firstLine="0"/>
         <w:jc w:val="center"/>
       </w:pPr>
@@ -8976,7 +9409,9 @@
       <w:pPr>
         <w:pStyle w:val="BodyText"/>
         <w:keepNext w:val="0"/>
-        <w:spacing w:before="39" w:after="120"/>
+        <w:pageBreakBefore w:val="0"/>
+        <w:widowControl/>
+        <w:spacing w:before="40" w:after="80"/>
         <w:ind w:left="290" w:firstLine="0"/>
       </w:pPr>
       <w:r>
@@ -8989,7 +9424,9 @@
     <w:p>
       <w:pPr>
         <w:pStyle w:val="Heading2"/>
-        <w:pageBreakBefore/>
+        <w:keepNext/>
+        <w:pageBreakBefore w:val="0"/>
+        <w:widowControl/>
         <w:numPr>
           <w:ilvl w:val="0"/>
           <w:numId w:val="1"/>
@@ -8997,7 +9434,7 @@
         <w:tabs>
           <w:tab w:val="left" w:pos="619"/>
         </w:tabs>
-        <w:spacing w:before="81" w:after="41"/>
+        <w:spacing w:before="40" w:after="80"/>
         <w:ind w:left="619" w:hanging="329"/>
       </w:pPr>
       <w:bookmarkStart w:name="10._Team_Contributions" w:id="10"/>
@@ -10306,134 +10743,10 @@
     </w:tbl>
     <w:p>
       <w:pPr>
-        <w:pStyle w:val="BodyText"/>
-        <w:keepNext w:val="0"/>
-        <w:spacing w:before="1"/>
-        <w:ind w:left="290" w:firstLine="0"/>
-      </w:pPr>
-      <w:r/>
-      <w:r>
-        <w:rPr>
-          <w:spacing w:val="-5"/>
-        </w:rPr>
-      </w:r>
-      <w:r/>
-      <w:r>
-        <w:rPr>
-          <w:spacing w:val="-3"/>
-        </w:rPr>
-      </w:r>
-      <w:r/>
-      <w:r>
-        <w:rPr>
-          <w:spacing w:val="-3"/>
-        </w:rPr>
-      </w:r>
-      <w:r/>
-      <w:r>
-        <w:rPr>
-          <w:spacing w:val="-3"/>
-        </w:rPr>
-      </w:r>
-      <w:r/>
-      <w:r>
-        <w:rPr>
-          <w:spacing w:val="-3"/>
-        </w:rPr>
-      </w:r>
-      <w:r/>
-      <w:r>
-        <w:rPr>
-          <w:spacing w:val="-2"/>
-        </w:rPr>
-      </w:r>
-      <w:r/>
-      <w:r>
-        <w:rPr>
-          <w:spacing w:val="-3"/>
-        </w:rPr>
-      </w:r>
-      <w:r/>
-      <w:r>
-        <w:rPr>
-          <w:spacing w:val="-2"/>
-        </w:rPr>
-      </w:r>
-      <w:r/>
-      <w:r>
-        <w:rPr>
-          <w:spacing w:val="-3"/>
-        </w:rPr>
-      </w:r>
-      <w:r/>
-      <w:r>
-        <w:rPr>
-          <w:spacing w:val="-4"/>
-        </w:rPr>
-      </w:r>
-      <w:r/>
-      <w:r>
-        <w:rPr>
-          <w:spacing w:val="-3"/>
-        </w:rPr>
-      </w:r>
-      <w:r/>
-      <w:r>
-        <w:rPr>
-          <w:spacing w:val="-3"/>
-        </w:rPr>
-      </w:r>
-      <w:r/>
-      <w:r>
-        <w:rPr>
-          <w:spacing w:val="-3"/>
-        </w:rPr>
-      </w:r>
-      <w:r/>
-      <w:r>
-        <w:rPr>
-          <w:spacing w:val="-2"/>
-        </w:rPr>
-      </w:r>
-      <w:r/>
-      <w:r>
-        <w:rPr>
-          <w:spacing w:val="-2"/>
-        </w:rPr>
-      </w:r>
-      <w:r/>
-      <w:r>
-        <w:rPr>
-          <w:spacing w:val="-3"/>
-        </w:rPr>
-      </w:r>
-      <w:r/>
-      <w:r>
-        <w:rPr>
-          <w:spacing w:val="-3"/>
-        </w:rPr>
-      </w:r>
-      <w:r/>
-      <w:r>
-        <w:rPr>
-          <w:spacing w:val="-2"/>
-        </w:rPr>
-      </w:r>
-      <w:r/>
-      <w:r>
-        <w:rPr>
-          <w:spacing w:val="-3"/>
-        </w:rPr>
-      </w:r>
-      <w:r>
-        <w:rPr>
-          <w:spacing w:val="-2"/>
-        </w:rPr>
-      </w:r>
-    </w:p>
-    <w:p>
-      <w:pPr>
         <w:pStyle w:val="Heading2"/>
+        <w:keepNext/>
+        <w:pageBreakBefore w:val="0"/>
+        <w:widowControl/>
         <w:numPr>
           <w:ilvl w:val="0"/>
           <w:numId w:val="1"/>
@@ -10441,6 +10754,7 @@
         <w:tabs>
           <w:tab w:val="left" w:pos="619"/>
         </w:tabs>
+        <w:spacing w:before="40" w:after="80"/>
         <w:ind w:left="619" w:hanging="329"/>
       </w:pPr>
       <w:bookmarkStart w:name="11._Conclusion_and_Future_Scope" w:id="11"/>
@@ -10496,7 +10810,9 @@
       <w:pPr>
         <w:pStyle w:val="BodyText"/>
         <w:keepNext w:val="0"/>
-        <w:spacing w:before="39"/>
+        <w:pageBreakBefore w:val="0"/>
+        <w:widowControl/>
+        <w:spacing w:before="40" w:after="80"/>
         <w:ind w:left="290" w:firstLine="0"/>
       </w:pPr>
       <w:r>
@@ -10578,9 +10894,10 @@
     <w:p>
       <w:pPr>
         <w:pStyle w:val="BodyText"/>
-        <w:keepNext w:val="0"/>
-        <w:pageBreakBefore/>
-        <w:spacing w:before="39" w:after="120"/>
+        <w:keepNext/>
+        <w:pageBreakBefore w:val="0"/>
+        <w:widowControl/>
+        <w:spacing w:before="40" w:after="80"/>
         <w:ind w:left="290" w:firstLine="0"/>
       </w:pPr>
       <w:r>
@@ -10594,7 +10911,9 @@
       <w:pPr>
         <w:pStyle w:val="BodyText"/>
         <w:keepNext w:val="0"/>
-        <w:spacing w:before="39" w:after="120"/>
+        <w:pageBreakBefore w:val="0"/>
+        <w:widowControl/>
+        <w:spacing w:before="40" w:after="80"/>
         <w:ind w:left="290" w:firstLine="0"/>
       </w:pPr>
       <w:r>
@@ -10608,7 +10927,9 @@
       <w:pPr>
         <w:pStyle w:val="BodyText"/>
         <w:keepNext w:val="0"/>
-        <w:spacing w:before="39" w:after="120"/>
+        <w:pageBreakBefore w:val="0"/>
+        <w:widowControl/>
+        <w:spacing w:before="40" w:after="80"/>
         <w:ind w:left="290" w:firstLine="0"/>
       </w:pPr>
       <w:r>
@@ -10622,7 +10943,9 @@
       <w:pPr>
         <w:pStyle w:val="BodyText"/>
         <w:keepNext w:val="0"/>
-        <w:spacing w:before="39" w:after="120"/>
+        <w:pageBreakBefore w:val="0"/>
+        <w:widowControl/>
+        <w:spacing w:before="40" w:after="80"/>
         <w:ind w:left="290" w:firstLine="0"/>
       </w:pPr>
       <w:r>
@@ -10636,7 +10959,9 @@
       <w:pPr>
         <w:pStyle w:val="BodyText"/>
         <w:keepNext w:val="0"/>
-        <w:spacing w:before="39" w:after="120"/>
+        <w:pageBreakBefore w:val="0"/>
+        <w:widowControl/>
+        <w:spacing w:before="40" w:after="80"/>
         <w:ind w:left="290" w:firstLine="0"/>
       </w:pPr>
       <w:r>
@@ -10650,7 +10975,9 @@
       <w:pPr>
         <w:pStyle w:val="BodyText"/>
         <w:keepNext w:val="0"/>
-        <w:spacing w:before="39" w:after="120"/>
+        <w:pageBreakBefore w:val="0"/>
+        <w:widowControl/>
+        <w:spacing w:before="40" w:after="80"/>
         <w:ind w:left="290" w:firstLine="0"/>
       </w:pPr>
       <w:r>
@@ -10664,7 +10991,9 @@
       <w:pPr>
         <w:pStyle w:val="BodyText"/>
         <w:keepNext w:val="0"/>
-        <w:spacing w:before="39" w:after="120"/>
+        <w:pageBreakBefore w:val="0"/>
+        <w:widowControl/>
+        <w:spacing w:before="40" w:after="80"/>
         <w:ind w:left="290" w:firstLine="0"/>
       </w:pPr>
       <w:r>
@@ -10675,8 +11004,9 @@
       </w:r>
     </w:p>
     <w:sectPr>
+      <w:type w:val="continuous"/>
       <w:pgSz w:w="12240" w:h="15840" w:orient="portrait"/>
-      <w:pgMar w:top="720" w:right="1080" w:bottom="880" w:left="720" w:header="0" w:footer="657" w:gutter="0"/>
+      <w:pgMar w:top="720" w:right="1080" w:bottom="1300" w:left="720" w:header="0" w:footer="657" w:gutter="0"/>
       <w:cols w:space="720"/>
     </w:sectPr>
   </w:body>
@@ -11004,47 +11334,6 @@
         <w:noProof/>
         <w:sz w:val="20"/>
       </w:rPr>
-      <w:drawing>
-        <wp:anchor distT="0" distB="0" distL="0" distR="0" simplePos="0" relativeHeight="251661312" behindDoc="1" locked="0" layoutInCell="1" allowOverlap="1" wp14:anchorId="61205D75" wp14:editId="31AE2C3E">
-          <wp:simplePos x="0" y="0"/>
-          <wp:positionH relativeFrom="page">
-            <wp:posOffset>2490470</wp:posOffset>
-          </wp:positionH>
-          <wp:positionV relativeFrom="paragraph">
-            <wp:posOffset>6733540</wp:posOffset>
-          </wp:positionV>
-          <wp:extent cx="2623185" cy="1190625"/>
-          <wp:effectExtent l="0" t="0" r="13335" b="13335"/>
-          <wp:wrapTopAndBottom/>
-          <wp:docPr id="3" name="Image 1"/>
-          <wp:cNvGraphicFramePr/>
-          <a:graphic xmlns:a="http://schemas.openxmlformats.org/drawingml/2006/main">
-            <a:graphicData uri="http://schemas.openxmlformats.org/drawingml/2006/picture">
-              <pic:pic xmlns:pic="http://schemas.openxmlformats.org/drawingml/2006/picture">
-                <pic:nvPicPr>
-                  <pic:cNvPr id="3" name="Image 1"/>
-                  <pic:cNvPicPr/>
-                </pic:nvPicPr>
-                <pic:blipFill>
-                  <a:blip r:embed="rId1" cstate="print"/>
-                  <a:stretch>
-                    <a:fillRect/>
-                  </a:stretch>
-                </pic:blipFill>
-                <pic:spPr>
-                  <a:xfrm>
-                    <a:off x="0" y="0"/>
-                    <a:ext cx="2623185" cy="1190625"/>
-                  </a:xfrm>
-                  <a:prstGeom prst="rect">
-                    <a:avLst/>
-                  </a:prstGeom>
-                </pic:spPr>
-              </pic:pic>
-            </a:graphicData>
-          </a:graphic>
-        </wp:anchor>
-      </w:drawing>
     </w:r>
   </w:p>
 </w:hdr>

</xml_diff>